<commit_message>
feat: complete institutional thesis archive system with thesis management and repository modules
</commit_message>
<xml_diff>
--- a/Master Build Spec.docx
+++ b/Master Build Spec.docx
@@ -4022,6 +4022,3446 @@
         <w:pStyle w:val="Heading2"/>
       </w:pPr>
       <w:r>
+        <w:t xml:space="preserve">UI/UX design system</w:t>
+      </w:r>
+    </w:p>
+    <w:p>
+      <w:pPr/>
+      <w:r>
+        <w:t xml:space="preserve">This section is the design brief for Phase 6. Where it disagrees with any screen description earlier in this document, this section wins. It was written against your current login and Users screens and the PECIT emblem.</w:t>
+      </w:r>
+    </w:p>
+    <w:p>
+      <w:pPr/>
+      <w:r>
+        <w:rPr>
+          <w:b/>
+        </w:rPr>
+        <w:t xml:space="preserve">Brand sources.</w:t>
+      </w:r>
+      <w:r>
+        <w:t xml:space="preserve"> The PECIT website returns only its two emblem images when read as text, so I could not read its stylesheet. The palette below comes from the emblem you attached (royal-blue gear ring, gold banner, red, white and blue shield), and every pair is checked for contrast. In Phase 6 the agent samples the emblem file and reports the exact values. If the website's own colors differ, paste them from your browser's developer tools and the tokens change in one file.</w:t>
+      </w:r>
+    </w:p>
+    <w:p>
+      <w:pPr>
+        <w:pStyle w:val="Heading3"/>
+      </w:pPr>
+      <w:r>
+        <w:t xml:space="preserve">What is wrong with the current screens</w:t>
+      </w:r>
+    </w:p>
+    <w:tbl>
+      <w:tblPr>
+        <w:tblStyle w:val="TableGrid"/>
+        <w:tblW w:w="0" w:type="auto"/>
+        <w:tblLayout w:type="fixed"/>
+        <w:tblLook w:val="04A0" w:firstRow="1" w:lastRow="0" w:firstColumn="0" w:lastColumn="0" w:noHBand="0" w:noVBand="1"/>
+      </w:tblPr>
+      <w:tblGrid>
+        <w:gridCol w:w="4068"/>
+        <w:gridCol w:w="2017"/>
+        <w:gridCol w:w="3275"/>
+      </w:tblGrid>
+      <w:tr>
+        <w:trPr>
+          <w:tblHeader/>
+        </w:trPr>
+        <w:tc>
+          <w:tcPr>
+            <w:tcW w:w="4068" w:type="dxa"/>
+            <w:shd w:val="clear" w:color="auto" w:fill="F2F2F2"/>
+          </w:tcPr>
+          <w:p>
+            <w:pPr/>
+            <w:r>
+              <w:t xml:space="preserve">Problem</w:t>
+            </w:r>
+          </w:p>
+        </w:tc>
+        <w:tc>
+          <w:tcPr>
+            <w:tcW w:w="2017" w:type="dxa"/>
+            <w:shd w:val="clear" w:color="auto" w:fill="F2F2F2"/>
+          </w:tcPr>
+          <w:p>
+            <w:pPr/>
+            <w:r>
+              <w:t xml:space="preserve">Screen</w:t>
+            </w:r>
+          </w:p>
+        </w:tc>
+        <w:tc>
+          <w:tcPr>
+            <w:tcW w:w="3275" w:type="dxa"/>
+            <w:shd w:val="clear" w:color="auto" w:fill="F2F2F2"/>
+          </w:tcPr>
+          <w:p>
+            <w:pPr/>
+            <w:r>
+              <w:t xml:space="preserve">Fix</w:t>
+            </w:r>
+          </w:p>
+        </w:tc>
+      </w:tr>
+      <w:tr>
+        <w:tc>
+          <w:tcPr>
+            <w:tcW w:w="4068" w:type="dxa"/>
+          </w:tcPr>
+          <w:p>
+            <w:pPr/>
+            <w:r>
+              <w:t xml:space="preserve">The electric-blue sidebar fills a fifth of the screen, clashes with the deeper blue of the emblem, and its inactive items and pink "Sign out" are hard to read</w:t>
+            </w:r>
+          </w:p>
+        </w:tc>
+        <w:tc>
+          <w:tcPr>
+            <w:tcW w:w="2017" w:type="dxa"/>
+          </w:tcPr>
+          <w:p>
+            <w:pPr/>
+            <w:r>
+              <w:t xml:space="preserve">Every app screen</w:t>
+            </w:r>
+          </w:p>
+        </w:tc>
+        <w:tc>
+          <w:tcPr>
+            <w:tcW w:w="3275" w:type="dxa"/>
+          </w:tcPr>
+          <w:p>
+            <w:pPr/>
+            <w:r>
+              <w:t xml:space="preserve">Navy sidebar with white and light-slate text; sign out moves into the user menu in the header</w:t>
+            </w:r>
+          </w:p>
+        </w:tc>
+      </w:tr>
+      <w:tr>
+        <w:tc>
+          <w:tcPr>
+            <w:tcW w:w="4068" w:type="dxa"/>
+          </w:tcPr>
+          <w:p>
+            <w:pPr/>
+            <w:r>
+              <w:t xml:space="preserve">The role under the administrator's name says "User"</w:t>
+            </w:r>
+          </w:p>
+        </w:tc>
+        <w:tc>
+          <w:tcPr>
+            <w:tcW w:w="2017" w:type="dxa"/>
+          </w:tcPr>
+          <w:p>
+            <w:pPr/>
+            <w:r>
+              <w:t xml:space="preserve">Sidebar</w:t>
+            </w:r>
+          </w:p>
+        </w:tc>
+        <w:tc>
+          <w:tcPr>
+            <w:tcW w:w="3275" w:type="dxa"/>
+          </w:tcPr>
+          <w:p>
+            <w:pPr/>
+            <w:r>
+              <w:t xml:space="preserve">Show the real role: Administrator</w:t>
+            </w:r>
+          </w:p>
+        </w:tc>
+      </w:tr>
+      <w:tr>
+        <w:tc>
+          <w:tcPr>
+            <w:tcW w:w="4068" w:type="dxa"/>
+          </w:tcPr>
+          <w:p>
+            <w:pPr/>
+            <w:r>
+              <w:t xml:space="preserve">Every role chip is the same green, so roles look alike, green suggests "all good", and CLIENT is the old name for Student</w:t>
+            </w:r>
+          </w:p>
+        </w:tc>
+        <w:tc>
+          <w:tcPr>
+            <w:tcW w:w="2017" w:type="dxa"/>
+          </w:tcPr>
+          <w:p>
+            <w:pPr/>
+            <w:r>
+              <w:t xml:space="preserve">Users</w:t>
+            </w:r>
+          </w:p>
+        </w:tc>
+        <w:tc>
+          <w:tcPr>
+            <w:tcW w:w="3275" w:type="dxa"/>
+          </w:tcPr>
+          <w:p>
+            <w:pPr/>
+            <w:r>
+              <w:t xml:space="preserve">Neutral chips with an icon and the label Student, Advisor, Librarian, Administrator, Super admin</w:t>
+            </w:r>
+          </w:p>
+        </w:tc>
+      </w:tr>
+      <w:tr>
+        <w:tc>
+          <w:tcPr>
+            <w:tcW w:w="4068" w:type="dxa"/>
+          </w:tcPr>
+          <w:p>
+            <w:pPr/>
+            <w:r>
+              <w:t xml:space="preserve">Row striping breaks partway across: some rows are grey from the middle onward</w:t>
+            </w:r>
+          </w:p>
+        </w:tc>
+        <w:tc>
+          <w:tcPr>
+            <w:tcW w:w="2017" w:type="dxa"/>
+          </w:tcPr>
+          <w:p>
+            <w:pPr/>
+            <w:r>
+              <w:t xml:space="preserve">Users</w:t>
+            </w:r>
+          </w:p>
+        </w:tc>
+        <w:tc>
+          <w:tcPr>
+            <w:tcW w:w="3275" w:type="dxa"/>
+          </w:tcPr>
+          <w:p>
+            <w:pPr/>
+            <w:r>
+              <w:t xml:space="preserve">No striping; one hover color across the whole row</w:t>
+            </w:r>
+          </w:p>
+        </w:tc>
+      </w:tr>
+      <w:tr>
+        <w:tc>
+          <w:tcPr>
+            <w:tcW w:w="4068" w:type="dxa"/>
+          </w:tcPr>
+          <w:p>
+            <w:pPr/>
+            <w:r>
+              <w:t xml:space="preserve">Avatars are mixed: a blank icon and cartoon pictures</w:t>
+            </w:r>
+          </w:p>
+        </w:tc>
+        <w:tc>
+          <w:tcPr>
+            <w:tcW w:w="2017" w:type="dxa"/>
+          </w:tcPr>
+          <w:p>
+            <w:pPr/>
+            <w:r>
+              <w:t xml:space="preserve">Users, sidebar</w:t>
+            </w:r>
+          </w:p>
+        </w:tc>
+        <w:tc>
+          <w:tcPr>
+            <w:tcW w:w="3275" w:type="dxa"/>
+          </w:tcPr>
+          <w:p>
+            <w:pPr/>
+            <w:r>
+              <w:t xml:space="preserve">One style: photo if uploaded, otherwise initials on a light-blue circle</w:t>
+            </w:r>
+          </w:p>
+        </w:tc>
+      </w:tr>
+      <w:tr>
+        <w:tc>
+          <w:tcPr>
+            <w:tcW w:w="4068" w:type="dxa"/>
+          </w:tcPr>
+          <w:p>
+            <w:pPr/>
+            <w:r>
+              <w:t xml:space="preserve">Sort, search and filter live in tiny unlabeled icons inside column headers</w:t>
+            </w:r>
+          </w:p>
+        </w:tc>
+        <w:tc>
+          <w:tcPr>
+            <w:tcW w:w="2017" w:type="dxa"/>
+          </w:tcPr>
+          <w:p>
+            <w:pPr/>
+            <w:r>
+              <w:t xml:space="preserve">Users</w:t>
+            </w:r>
+          </w:p>
+        </w:tc>
+        <w:tc>
+          <w:tcPr>
+            <w:tcW w:w="3275" w:type="dxa"/>
+          </w:tcPr>
+          <w:p>
+            <w:pPr/>
+            <w:r>
+              <w:t xml:space="preserve">A toolbar with labeled filters, active-filter chips, and sortable headers that announce their sort order</w:t>
+            </w:r>
+          </w:p>
+        </w:tc>
+      </w:tr>
+      <w:tr>
+        <w:tc>
+          <w:tcPr>
+            <w:tcW w:w="4068" w:type="dxa"/>
+          </w:tcPr>
+          <w:p>
+            <w:pPr/>
+            <w:r>
+              <w:t xml:space="preserve">No status and no row actions: nothing to edit, reset or deactivate</w:t>
+            </w:r>
+          </w:p>
+        </w:tc>
+        <w:tc>
+          <w:tcPr>
+            <w:tcW w:w="2017" w:type="dxa"/>
+          </w:tcPr>
+          <w:p>
+            <w:pPr/>
+            <w:r>
+              <w:t xml:space="preserve">Users</w:t>
+            </w:r>
+          </w:p>
+        </w:tc>
+        <w:tc>
+          <w:tcPr>
+            <w:tcW w:w="3275" w:type="dxa"/>
+          </w:tcPr>
+          <w:p>
+            <w:pPr/>
+            <w:r>
+              <w:t xml:space="preserve">Status column and a row menu with Edit, Change role, Reset password, Deactivate</w:t>
+            </w:r>
+          </w:p>
+        </w:tc>
+      </w:tr>
+      <w:tr>
+        <w:tc>
+          <w:tcPr>
+            <w:tcW w:w="4068" w:type="dxa"/>
+          </w:tcPr>
+          <w:p>
+            <w:pPr/>
+            <w:r>
+              <w:t xml:space="preserve">The card stretches to the page bottom, and columns spread across a 1900 px window with wide gaps</w:t>
+            </w:r>
+          </w:p>
+        </w:tc>
+        <w:tc>
+          <w:tcPr>
+            <w:tcW w:w="2017" w:type="dxa"/>
+          </w:tcPr>
+          <w:p>
+            <w:pPr/>
+            <w:r>
+              <w:t xml:space="preserve">Users</w:t>
+            </w:r>
+          </w:p>
+        </w:tc>
+        <w:tc>
+          <w:tcPr>
+            <w:tcW w:w="3275" w:type="dxa"/>
+          </w:tcPr>
+          <w:p>
+            <w:pPr/>
+            <w:r>
+              <w:t xml:space="preserve">Cards fit their content, content has a maximum width, rows are 56 px high</w:t>
+            </w:r>
+          </w:p>
+        </w:tc>
+      </w:tr>
+      <w:tr>
+        <w:tc>
+          <w:tcPr>
+            <w:tcW w:w="4068" w:type="dxa"/>
+          </w:tcPr>
+          <w:p>
+            <w:pPr/>
+            <w:r>
+              <w:t xml:space="preserve">A faded emblem watermark shows through behind the content</w:t>
+            </w:r>
+          </w:p>
+        </w:tc>
+        <w:tc>
+          <w:tcPr>
+            <w:tcW w:w="2017" w:type="dxa"/>
+          </w:tcPr>
+          <w:p>
+            <w:pPr/>
+            <w:r>
+              <w:t xml:space="preserve">App shell</w:t>
+            </w:r>
+          </w:p>
+        </w:tc>
+        <w:tc>
+          <w:tcPr>
+            <w:tcW w:w="3275" w:type="dxa"/>
+          </w:tcPr>
+          <w:p>
+            <w:pPr/>
+            <w:r>
+              <w:t xml:space="preserve">Remove it</w:t>
+            </w:r>
+          </w:p>
+        </w:tc>
+      </w:tr>
+      <w:tr>
+        <w:tc>
+          <w:tcPr>
+            <w:tcW w:w="4068" w:type="dxa"/>
+          </w:tcPr>
+          <w:p>
+            <w:pPr/>
+            <w:r>
+              <w:t xml:space="preserve">The page title and institution name are all capitals in tiny type</w:t>
+            </w:r>
+          </w:p>
+        </w:tc>
+        <w:tc>
+          <w:tcPr>
+            <w:tcW w:w="2017" w:type="dxa"/>
+          </w:tcPr>
+          <w:p>
+            <w:pPr/>
+            <w:r>
+              <w:t xml:space="preserve">Header</w:t>
+            </w:r>
+          </w:p>
+        </w:tc>
+        <w:tc>
+          <w:tcPr>
+            <w:tcW w:w="3275" w:type="dxa"/>
+          </w:tcPr>
+          <w:p>
+            <w:pPr/>
+            <w:r>
+              <w:t xml:space="preserve">Sentence case; the system name sits in the sidebar, the full institution name on login and public pages</w:t>
+            </w:r>
+          </w:p>
+        </w:tc>
+      </w:tr>
+      <w:tr>
+        <w:tc>
+          <w:tcPr>
+            <w:tcW w:w="4068" w:type="dxa"/>
+          </w:tcPr>
+          <w:p>
+            <w:pPr/>
+            <w:r>
+              <w:t xml:space="preserve">The bell shows no unread count, and the legal footer text is about 11 px</w:t>
+            </w:r>
+          </w:p>
+        </w:tc>
+        <w:tc>
+          <w:tcPr>
+            <w:tcW w:w="2017" w:type="dxa"/>
+          </w:tcPr>
+          <w:p>
+            <w:pPr/>
+            <w:r>
+              <w:t xml:space="preserve">Header, footer</w:t>
+            </w:r>
+          </w:p>
+        </w:tc>
+        <w:tc>
+          <w:tcPr>
+            <w:tcW w:w="3275" w:type="dxa"/>
+          </w:tcPr>
+          <w:p>
+            <w:pPr/>
+            <w:r>
+              <w:t xml:space="preserve">Count badge with a notification list; 12 px minimum text</w:t>
+            </w:r>
+          </w:p>
+        </w:tc>
+      </w:tr>
+      <w:tr>
+        <w:tc>
+          <w:tcPr>
+            <w:tcW w:w="4068" w:type="dxa"/>
+          </w:tcPr>
+          <w:p>
+            <w:pPr/>
+            <w:r>
+              <w:t xml:space="preserve">The emblem's blue ring sits on a blue tile, so its outline disappears</w:t>
+            </w:r>
+          </w:p>
+        </w:tc>
+        <w:tc>
+          <w:tcPr>
+            <w:tcW w:w="2017" w:type="dxa"/>
+          </w:tcPr>
+          <w:p>
+            <w:pPr/>
+            <w:r>
+              <w:t xml:space="preserve">Login</w:t>
+            </w:r>
+          </w:p>
+        </w:tc>
+        <w:tc>
+          <w:tcPr>
+            <w:tcW w:w="3275" w:type="dxa"/>
+          </w:tcPr>
+          <w:p>
+            <w:pPr/>
+            <w:r>
+              <w:t xml:space="preserve">Place the emblem on white</w:t>
+            </w:r>
+          </w:p>
+        </w:tc>
+      </w:tr>
+      <w:tr>
+        <w:tc>
+          <w:tcPr>
+            <w:tcW w:w="4068" w:type="dxa"/>
+          </w:tcPr>
+          <w:p>
+            <w:pPr/>
+            <w:r>
+              <w:t xml:space="preserve">Fields have placeholders but no visible labels</w:t>
+            </w:r>
+          </w:p>
+        </w:tc>
+        <w:tc>
+          <w:tcPr>
+            <w:tcW w:w="2017" w:type="dxa"/>
+          </w:tcPr>
+          <w:p>
+            <w:pPr/>
+            <w:r>
+              <w:t xml:space="preserve">Login</w:t>
+            </w:r>
+          </w:p>
+        </w:tc>
+        <w:tc>
+          <w:tcPr>
+            <w:tcW w:w="3275" w:type="dxa"/>
+          </w:tcPr>
+          <w:p>
+            <w:pPr/>
+            <w:r>
+              <w:t xml:space="preserve">Visible labels above every field</w:t>
+            </w:r>
+          </w:p>
+        </w:tc>
+      </w:tr>
+      <w:tr>
+        <w:tc>
+          <w:tcPr>
+            <w:tcW w:w="4068" w:type="dxa"/>
+          </w:tcPr>
+          <w:p>
+            <w:pPr/>
+            <w:r>
+              <w:t xml:space="preserve">The "Remember me" label is dark on dark blue and nearly invisible</w:t>
+            </w:r>
+          </w:p>
+        </w:tc>
+        <w:tc>
+          <w:tcPr>
+            <w:tcW w:w="2017" w:type="dxa"/>
+          </w:tcPr>
+          <w:p>
+            <w:pPr/>
+            <w:r>
+              <w:t xml:space="preserve">Login</w:t>
+            </w:r>
+          </w:p>
+        </w:tc>
+        <w:tc>
+          <w:tcPr>
+            <w:tcW w:w="3275" w:type="dxa"/>
+          </w:tcPr>
+          <w:p>
+            <w:pPr/>
+            <w:r>
+              <w:t xml:space="preserve">White card or white text; see the new layout</w:t>
+            </w:r>
+          </w:p>
+        </w:tc>
+      </w:tr>
+      <w:tr>
+        <w:tc>
+          <w:tcPr>
+            <w:tcW w:w="4068" w:type="dxa"/>
+          </w:tcPr>
+          <w:p>
+            <w:pPr/>
+            <w:r>
+              <w:t xml:space="preserve">"Security Verification Bypassed" reads like an error and exposes a developer setting</w:t>
+            </w:r>
+          </w:p>
+        </w:tc>
+        <w:tc>
+          <w:tcPr>
+            <w:tcW w:w="2017" w:type="dxa"/>
+          </w:tcPr>
+          <w:p>
+            <w:pPr/>
+            <w:r>
+              <w:t xml:space="preserve">Login</w:t>
+            </w:r>
+          </w:p>
+        </w:tc>
+        <w:tc>
+          <w:tcPr>
+            <w:tcW w:w="3275" w:type="dxa"/>
+          </w:tcPr>
+          <w:p>
+            <w:pPr/>
+            <w:r>
+              <w:t xml:space="preserve">Remove; show a message only when verification fails, and a small development-only note in dev builds</w:t>
+            </w:r>
+          </w:p>
+        </w:tc>
+      </w:tr>
+      <w:tr>
+        <w:tc>
+          <w:tcPr>
+            <w:tcW w:w="4068" w:type="dxa"/>
+          </w:tcPr>
+          <w:p>
+            <w:pPr/>
+            <w:r>
+              <w:t xml:space="preserve">Sign in and Sign in with Google are two identical white buttons, so the disabled one looks as inviting as the real one</w:t>
+            </w:r>
+          </w:p>
+        </w:tc>
+        <w:tc>
+          <w:tcPr>
+            <w:tcW w:w="2017" w:type="dxa"/>
+          </w:tcPr>
+          <w:p>
+            <w:pPr/>
+            <w:r>
+              <w:t xml:space="preserve">Login</w:t>
+            </w:r>
+          </w:p>
+        </w:tc>
+        <w:tc>
+          <w:tcPr>
+            <w:tcW w:w="3275" w:type="dxa"/>
+          </w:tcPr>
+          <w:p>
+            <w:pPr/>
+            <w:r>
+              <w:t xml:space="preserve">One primary button; Google is a secondary, clearly disabled button with a visible explanation</w:t>
+            </w:r>
+          </w:p>
+        </w:tc>
+      </w:tr>
+      <w:tr>
+        <w:tc>
+          <w:tcPr>
+            <w:tcW w:w="4068" w:type="dxa"/>
+          </w:tcPr>
+          <w:p>
+            <w:pPr/>
+            <w:r>
+              <w:t xml:space="preserve">The moving network-line background has nothing to do with theses and adds motion and load</w:t>
+            </w:r>
+          </w:p>
+        </w:tc>
+        <w:tc>
+          <w:tcPr>
+            <w:tcW w:w="2017" w:type="dxa"/>
+          </w:tcPr>
+          <w:p>
+            <w:pPr/>
+            <w:r>
+              <w:t xml:space="preserve">Login</w:t>
+            </w:r>
+          </w:p>
+        </w:tc>
+        <w:tc>
+          <w:tcPr>
+            <w:tcW w:w="3275" w:type="dxa"/>
+          </w:tcPr>
+          <w:p>
+            <w:pPr/>
+            <w:r>
+              <w:t xml:space="preserve">Replace with the static trace pattern described below</w:t>
+            </w:r>
+          </w:p>
+        </w:tc>
+      </w:tr>
+      <w:tr>
+        <w:tc>
+          <w:tcPr>
+            <w:tcW w:w="4068" w:type="dxa"/>
+          </w:tcPr>
+          <w:p>
+            <w:pPr/>
+            <w:r>
+              <w:t xml:space="preserve">"Secured Connection - SSL Protected" is a claim users cannot verify, and "Contact Administrator" is not actionable</w:t>
+            </w:r>
+          </w:p>
+        </w:tc>
+        <w:tc>
+          <w:tcPr>
+            <w:tcW w:w="2017" w:type="dxa"/>
+          </w:tcPr>
+          <w:p>
+            <w:pPr/>
+            <w:r>
+              <w:t xml:space="preserve">Login</w:t>
+            </w:r>
+          </w:p>
+        </w:tc>
+        <w:tc>
+          <w:tcPr>
+            <w:tcW w:w="3275" w:type="dxa"/>
+          </w:tcPr>
+          <w:p>
+            <w:pPr/>
+            <w:r>
+              <w:t xml:space="preserve">Remove the badge; show the administrator's email as a link</w:t>
+            </w:r>
+          </w:p>
+        </w:tc>
+      </w:tr>
+    </w:tbl>
+    <w:p>
+      <w:pPr>
+        <w:pStyle w:val="Heading3"/>
+      </w:pPr>
+      <w:r>
+        <w:t xml:space="preserve">Design direction</w:t>
+      </w:r>
+    </w:p>
+    <w:p>
+      <w:pPr/>
+      <w:r>
+        <w:t xml:space="preserve">The interface should feel like a research library that belongs to an electronics institute: calm, exact and built around reading. It stays quiet so thesis titles and abstracts carry each page. Navy and white do the structural work, and gold is a signal used sparingly.</w:t>
+      </w:r>
+    </w:p>
+    <w:p>
+      <w:pPr/>
+      <w:r>
+        <w:t xml:space="preserve">The one memorable device is </w:t>
+      </w:r>
+      <w:r>
+        <w:rPr>
+          <w:b/>
+        </w:rPr>
+        <w:t xml:space="preserve">the trace</w:t>
+      </w:r>
+      <w:r>
+        <w:t xml:space="preserve">, a thin gold line with right-angle turns, like a copper trace on a circuit board. It appears in four places only: large and faint behind the login brand panel, as the active-item marker in the sidebar, as the connector between steps in the submission wizard, and as the vertical line of a thesis's status timeline. Everything else stays plain. It is a static SVG under 4 KB and moves only when a wizard step completes.</w:t>
+      </w:r>
+    </w:p>
+    <w:p>
+      <w:pPr/>
+      <w:r>
+        <w:t xml:space="preserve">Principles:</w:t>
+      </w:r>
+    </w:p>
+    <w:p>
+      <w:pPr>
+        <w:pStyle w:val="ListParagraph"/>
+        <w:numPr>
+          <w:ilvl w:val="0"/>
+          <w:numId w:val="12"/>
+        </w:numPr>
+      </w:pPr>
+      <w:r>
+        <w:t xml:space="preserve">Content first. Thesis titles are set in a serif and given room.</w:t>
+      </w:r>
+    </w:p>
+    <w:p>
+      <w:pPr>
+        <w:pStyle w:val="ListParagraph"/>
+        <w:numPr>
+          <w:ilvl w:val="0"/>
+          <w:numId w:val="12"/>
+        </w:numPr>
+      </w:pPr>
+      <w:r>
+        <w:t xml:space="preserve">One primary action per screen.</w:t>
+      </w:r>
+    </w:p>
+    <w:p>
+      <w:pPr>
+        <w:pStyle w:val="ListParagraph"/>
+        <w:numPr>
+          <w:ilvl w:val="0"/>
+          <w:numId w:val="12"/>
+        </w:numPr>
+      </w:pPr>
+      <w:r>
+        <w:t xml:space="preserve">Every message says what happened and what to do next.</w:t>
+      </w:r>
+    </w:p>
+    <w:p>
+      <w:pPr>
+        <w:pStyle w:val="ListParagraph"/>
+        <w:numPr>
+          <w:ilvl w:val="0"/>
+          <w:numId w:val="12"/>
+        </w:numPr>
+      </w:pPr>
+      <w:r>
+        <w:t xml:space="preserve">Color never carries meaning alone; every status has a label and an icon.</w:t>
+      </w:r>
+    </w:p>
+    <w:p>
+      <w:pPr>
+        <w:pStyle w:val="ListParagraph"/>
+        <w:numPr>
+          <w:ilvl w:val="0"/>
+          <w:numId w:val="12"/>
+        </w:numPr>
+      </w:pPr>
+      <w:r>
+        <w:t xml:space="preserve">Nothing decorative moves. No gradients, particle backgrounds, watermarks or animated heroes.</w:t>
+      </w:r>
+    </w:p>
+    <w:p>
+      <w:pPr>
+        <w:pStyle w:val="Heading3"/>
+      </w:pPr>
+      <w:r>
+        <w:t xml:space="preserve">Logo and brand rules</w:t>
+      </w:r>
+    </w:p>
+    <w:p>
+      <w:pPr>
+        <w:pStyle w:val="ListParagraph"/>
+        <w:numPr>
+          <w:ilvl w:val="0"/>
+          <w:numId w:val="13"/>
+        </w:numPr>
+      </w:pPr>
+      <w:r>
+        <w:t xml:space="preserve">Put the emblem on white or the lightest tint, or inside a white circle on navy. Never put it directly on blue.</w:t>
+      </w:r>
+    </w:p>
+    <w:p>
+      <w:pPr>
+        <w:pStyle w:val="ListParagraph"/>
+        <w:numPr>
+          <w:ilvl w:val="0"/>
+          <w:numId w:val="13"/>
+        </w:numPr>
+      </w:pPr>
+      <w:r>
+        <w:t xml:space="preserve">Keep clear space of a quarter of the emblem's width on every side, a minimum height of 32 px, and never stretch, recolor, rotate or add effects.</w:t>
+      </w:r>
+    </w:p>
+    <w:p>
+      <w:pPr>
+        <w:pStyle w:val="ListParagraph"/>
+        <w:numPr>
+          <w:ilvl w:val="0"/>
+          <w:numId w:val="13"/>
+        </w:numPr>
+      </w:pPr>
+      <w:r>
+        <w:t xml:space="preserve">The file you supplied has a white background and low resolution. Ask PECIT's administration for a vector (SVG) or a transparent high-resolution PNG, and until then serve the current file at twice its display size with </w:t>
+      </w:r>
+      <w:r>
+        <w:rPr>
+          <w:rStyle w:val="CodeChar"/>
+        </w:rPr>
+        <w:t xml:space="preserve">next/image</w:t>
+      </w:r>
+      <w:r>
+        <w:t xml:space="preserve">.</w:t>
+      </w:r>
+    </w:p>
+    <w:p>
+      <w:pPr>
+        <w:pStyle w:val="ListParagraph"/>
+        <w:numPr>
+          <w:ilvl w:val="0"/>
+          <w:numId w:val="13"/>
+        </w:numPr>
+      </w:pPr>
+      <w:r>
+        <w:t xml:space="preserve">The app calls itself "PECIT Thesis Archive". The full institution name appears on the login page, the public archive header and the footer.</w:t>
+      </w:r>
+    </w:p>
+    <w:p>
+      <w:pPr>
+        <w:pStyle w:val="ListParagraph"/>
+        <w:numPr>
+          <w:ilvl w:val="0"/>
+          <w:numId w:val="13"/>
+        </w:numPr>
+      </w:pPr>
+      <w:r>
+        <w:t xml:space="preserve">Get PECIT's written permission to use the emblem and name (it is on the Stage 7 checklist).</w:t>
+      </w:r>
+    </w:p>
+    <w:p>
+      <w:pPr>
+        <w:pStyle w:val="Heading3"/>
+      </w:pPr>
+      <w:r>
+        <w:t xml:space="preserve">Color</w:t>
+      </w:r>
+    </w:p>
+    <w:p>
+      <w:pPr/>
+      <w:r>
+        <w:t xml:space="preserve">Light theme only for the first release; dark mode is out of scope.</w:t>
+      </w:r>
+    </w:p>
+    <w:tbl>
+      <w:tblPr>
+        <w:tblStyle w:val="TableGrid"/>
+        <w:tblW w:w="0" w:type="auto"/>
+        <w:tblLayout w:type="fixed"/>
+        <w:tblLook w:val="04A0" w:firstRow="1" w:lastRow="0" w:firstColumn="0" w:lastColumn="0" w:noHBand="0" w:noVBand="1"/>
+      </w:tblPr>
+      <w:tblGrid>
+        <w:gridCol w:w="1916"/>
+        <w:gridCol w:w="1261"/>
+        <w:gridCol w:w="3321"/>
+        <w:gridCol w:w="2862"/>
+      </w:tblGrid>
+      <w:tr>
+        <w:trPr>
+          <w:tblHeader/>
+        </w:trPr>
+        <w:tc>
+          <w:tcPr>
+            <w:tcW w:w="1916" w:type="dxa"/>
+            <w:shd w:val="clear" w:color="auto" w:fill="F2F2F2"/>
+          </w:tcPr>
+          <w:p>
+            <w:pPr/>
+            <w:r>
+              <w:t xml:space="preserve">Token</w:t>
+            </w:r>
+          </w:p>
+        </w:tc>
+        <w:tc>
+          <w:tcPr>
+            <w:tcW w:w="1261" w:type="dxa"/>
+            <w:shd w:val="clear" w:color="auto" w:fill="F2F2F2"/>
+          </w:tcPr>
+          <w:p>
+            <w:pPr/>
+            <w:r>
+              <w:t xml:space="preserve">Value</w:t>
+            </w:r>
+          </w:p>
+        </w:tc>
+        <w:tc>
+          <w:tcPr>
+            <w:tcW w:w="3321" w:type="dxa"/>
+            <w:shd w:val="clear" w:color="auto" w:fill="F2F2F2"/>
+          </w:tcPr>
+          <w:p>
+            <w:pPr/>
+            <w:r>
+              <w:t xml:space="preserve">Use</w:t>
+            </w:r>
+          </w:p>
+        </w:tc>
+        <w:tc>
+          <w:tcPr>
+            <w:tcW w:w="2862" w:type="dxa"/>
+            <w:shd w:val="clear" w:color="auto" w:fill="F2F2F2"/>
+          </w:tcPr>
+          <w:p>
+            <w:pPr/>
+            <w:r>
+              <w:t xml:space="preserve">Contrast</w:t>
+            </w:r>
+          </w:p>
+        </w:tc>
+      </w:tr>
+      <w:tr>
+        <w:tc>
+          <w:tcPr>
+            <w:tcW w:w="1916" w:type="dxa"/>
+          </w:tcPr>
+          <w:p>
+            <w:pPr/>
+            <w:r>
+              <w:rPr>
+                <w:rStyle w:val="CodeChar"/>
+              </w:rPr>
+              <w:t xml:space="preserve">brand-900</w:t>
+            </w:r>
+          </w:p>
+        </w:tc>
+        <w:tc>
+          <w:tcPr>
+            <w:tcW w:w="1261" w:type="dxa"/>
+          </w:tcPr>
+          <w:p>
+            <w:pPr/>
+            <w:r>
+              <w:t xml:space="preserve">#0F2A66</w:t>
+            </w:r>
+          </w:p>
+        </w:tc>
+        <w:tc>
+          <w:tcPr>
+            <w:tcW w:w="3321" w:type="dxa"/>
+          </w:tcPr>
+          <w:p>
+            <w:pPr/>
+            <w:r>
+              <w:t xml:space="preserve">Sidebar, archive hero, headings on light</w:t>
+            </w:r>
+          </w:p>
+        </w:tc>
+        <w:tc>
+          <w:tcPr>
+            <w:tcW w:w="2862" w:type="dxa"/>
+          </w:tcPr>
+          <w:p>
+            <w:pPr/>
+            <w:r>
+              <w:t xml:space="preserve">13.61 with white text</w:t>
+            </w:r>
+          </w:p>
+        </w:tc>
+      </w:tr>
+      <w:tr>
+        <w:tc>
+          <w:tcPr>
+            <w:tcW w:w="1916" w:type="dxa"/>
+          </w:tcPr>
+          <w:p>
+            <w:pPr/>
+            <w:r>
+              <w:rPr>
+                <w:rStyle w:val="CodeChar"/>
+              </w:rPr>
+              <w:t xml:space="preserve">brand-800</w:t>
+            </w:r>
+          </w:p>
+        </w:tc>
+        <w:tc>
+          <w:tcPr>
+            <w:tcW w:w="1261" w:type="dxa"/>
+          </w:tcPr>
+          <w:p>
+            <w:pPr/>
+            <w:r>
+              <w:t xml:space="preserve">#163F85</w:t>
+            </w:r>
+          </w:p>
+        </w:tc>
+        <w:tc>
+          <w:tcPr>
+            <w:tcW w:w="3321" w:type="dxa"/>
+          </w:tcPr>
+          <w:p>
+            <w:pPr/>
+            <w:r>
+              <w:t xml:space="preserve">Hover and pressed state of primary buttons</w:t>
+            </w:r>
+          </w:p>
+        </w:tc>
+        <w:tc>
+          <w:tcPr>
+            <w:tcW w:w="2862" w:type="dxa"/>
+          </w:tcPr>
+          <w:p>
+            <w:pPr/>
+            <w:r>
+              <w:t xml:space="preserve">10.08 with white text</w:t>
+            </w:r>
+          </w:p>
+        </w:tc>
+      </w:tr>
+      <w:tr>
+        <w:tc>
+          <w:tcPr>
+            <w:tcW w:w="1916" w:type="dxa"/>
+          </w:tcPr>
+          <w:p>
+            <w:pPr/>
+            <w:r>
+              <w:rPr>
+                <w:rStyle w:val="CodeChar"/>
+              </w:rPr>
+              <w:t xml:space="preserve">brand-700</w:t>
+            </w:r>
+          </w:p>
+        </w:tc>
+        <w:tc>
+          <w:tcPr>
+            <w:tcW w:w="1261" w:type="dxa"/>
+          </w:tcPr>
+          <w:p>
+            <w:pPr/>
+            <w:r>
+              <w:t xml:space="preserve">#1B4DA1</w:t>
+            </w:r>
+          </w:p>
+        </w:tc>
+        <w:tc>
+          <w:tcPr>
+            <w:tcW w:w="3321" w:type="dxa"/>
+          </w:tcPr>
+          <w:p>
+            <w:pPr/>
+            <w:r>
+              <w:t xml:space="preserve">Primary buttons, links, focus ring</w:t>
+            </w:r>
+          </w:p>
+        </w:tc>
+        <w:tc>
+          <w:tcPr>
+            <w:tcW w:w="2862" w:type="dxa"/>
+          </w:tcPr>
+          <w:p>
+            <w:pPr/>
+            <w:r>
+              <w:t xml:space="preserve">8.01 on white, 7.40 on the page background</w:t>
+            </w:r>
+          </w:p>
+        </w:tc>
+      </w:tr>
+      <w:tr>
+        <w:tc>
+          <w:tcPr>
+            <w:tcW w:w="1916" w:type="dxa"/>
+          </w:tcPr>
+          <w:p>
+            <w:pPr/>
+            <w:r>
+              <w:rPr>
+                <w:rStyle w:val="CodeChar"/>
+              </w:rPr>
+              <w:t xml:space="preserve">brand-100</w:t>
+            </w:r>
+          </w:p>
+        </w:tc>
+        <w:tc>
+          <w:tcPr>
+            <w:tcW w:w="1261" w:type="dxa"/>
+          </w:tcPr>
+          <w:p>
+            <w:pPr/>
+            <w:r>
+              <w:t xml:space="preserve">#E6EEFB</w:t>
+            </w:r>
+          </w:p>
+        </w:tc>
+        <w:tc>
+          <w:tcPr>
+            <w:tcW w:w="3321" w:type="dxa"/>
+          </w:tcPr>
+          <w:p>
+            <w:pPr/>
+            <w:r>
+              <w:t xml:space="preserve">Selected rows, information panels</w:t>
+            </w:r>
+          </w:p>
+        </w:tc>
+        <w:tc>
+          <w:tcPr>
+            <w:tcW w:w="2862" w:type="dxa"/>
+          </w:tcPr>
+          <w:p>
+            <w:pPr/>
+            <w:r>
+              <w:t xml:space="preserve">6.86 with brand-700 text</w:t>
+            </w:r>
+          </w:p>
+        </w:tc>
+      </w:tr>
+      <w:tr>
+        <w:tc>
+          <w:tcPr>
+            <w:tcW w:w="1916" w:type="dxa"/>
+          </w:tcPr>
+          <w:p>
+            <w:pPr/>
+            <w:r>
+              <w:rPr>
+                <w:rStyle w:val="CodeChar"/>
+              </w:rPr>
+              <w:t xml:space="preserve">gold-400</w:t>
+            </w:r>
+          </w:p>
+        </w:tc>
+        <w:tc>
+          <w:tcPr>
+            <w:tcW w:w="1261" w:type="dxa"/>
+          </w:tcPr>
+          <w:p>
+            <w:pPr/>
+            <w:r>
+              <w:t xml:space="preserve">#F9D71C</w:t>
+            </w:r>
+          </w:p>
+        </w:tc>
+        <w:tc>
+          <w:tcPr>
+            <w:tcW w:w="3321" w:type="dxa"/>
+          </w:tcPr>
+          <w:p>
+            <w:pPr/>
+            <w:r>
+              <w:t xml:space="preserve">The trace, active marker, search highlights; never as text on a light surface</w:t>
+            </w:r>
+          </w:p>
+        </w:tc>
+        <w:tc>
+          <w:tcPr>
+            <w:tcW w:w="2862" w:type="dxa"/>
+          </w:tcPr>
+          <w:p>
+            <w:pPr/>
+            <w:r>
+              <w:t xml:space="preserve">12.55 with ink text, 9.57 on brand-900, only 1.42 on white</w:t>
+            </w:r>
+          </w:p>
+        </w:tc>
+      </w:tr>
+      <w:tr>
+        <w:tc>
+          <w:tcPr>
+            <w:tcW w:w="1916" w:type="dxa"/>
+          </w:tcPr>
+          <w:p>
+            <w:pPr/>
+            <w:r>
+              <w:rPr>
+                <w:rStyle w:val="CodeChar"/>
+              </w:rPr>
+              <w:t xml:space="preserve">gold-100</w:t>
+            </w:r>
+          </w:p>
+        </w:tc>
+        <w:tc>
+          <w:tcPr>
+            <w:tcW w:w="1261" w:type="dxa"/>
+          </w:tcPr>
+          <w:p>
+            <w:pPr/>
+            <w:r>
+              <w:t xml:space="preserve">#FEF6CC</w:t>
+            </w:r>
+          </w:p>
+        </w:tc>
+        <w:tc>
+          <w:tcPr>
+            <w:tcW w:w="3321" w:type="dxa"/>
+          </w:tcPr>
+          <w:p>
+            <w:pPr/>
+            <w:r>
+              <w:t xml:space="preserve">Notice banners</w:t>
+            </w:r>
+          </w:p>
+        </w:tc>
+        <w:tc>
+          <w:tcPr>
+            <w:tcW w:w="2862" w:type="dxa"/>
+          </w:tcPr>
+          <w:p>
+            <w:pPr/>
+            <w:r>
+              <w:t xml:space="preserve">16.38 with ink text</w:t>
+            </w:r>
+          </w:p>
+        </w:tc>
+      </w:tr>
+      <w:tr>
+        <w:tc>
+          <w:tcPr>
+            <w:tcW w:w="1916" w:type="dxa"/>
+          </w:tcPr>
+          <w:p>
+            <w:pPr/>
+            <w:r>
+              <w:rPr>
+                <w:rStyle w:val="CodeChar"/>
+              </w:rPr>
+              <w:t xml:space="preserve">ink</w:t>
+            </w:r>
+          </w:p>
+        </w:tc>
+        <w:tc>
+          <w:tcPr>
+            <w:tcW w:w="1261" w:type="dxa"/>
+          </w:tcPr>
+          <w:p>
+            <w:pPr/>
+            <w:r>
+              <w:t xml:space="preserve">#0F172A</w:t>
+            </w:r>
+          </w:p>
+        </w:tc>
+        <w:tc>
+          <w:tcPr>
+            <w:tcW w:w="3321" w:type="dxa"/>
+          </w:tcPr>
+          <w:p>
+            <w:pPr/>
+            <w:r>
+              <w:t xml:space="preserve">Body text</w:t>
+            </w:r>
+          </w:p>
+        </w:tc>
+        <w:tc>
+          <w:tcPr>
+            <w:tcW w:w="2862" w:type="dxa"/>
+          </w:tcPr>
+          <w:p>
+            <w:pPr/>
+            <w:r>
+              <w:t xml:space="preserve">16.50 on the page background</w:t>
+            </w:r>
+          </w:p>
+        </w:tc>
+      </w:tr>
+      <w:tr>
+        <w:tc>
+          <w:tcPr>
+            <w:tcW w:w="1916" w:type="dxa"/>
+          </w:tcPr>
+          <w:p>
+            <w:pPr/>
+            <w:r>
+              <w:rPr>
+                <w:rStyle w:val="CodeChar"/>
+              </w:rPr>
+              <w:t xml:space="preserve">slate-700</w:t>
+            </w:r>
+          </w:p>
+        </w:tc>
+        <w:tc>
+          <w:tcPr>
+            <w:tcW w:w="1261" w:type="dxa"/>
+          </w:tcPr>
+          <w:p>
+            <w:pPr/>
+            <w:r>
+              <w:t xml:space="preserve">#334155</w:t>
+            </w:r>
+          </w:p>
+        </w:tc>
+        <w:tc>
+          <w:tcPr>
+            <w:tcW w:w="3321" w:type="dxa"/>
+          </w:tcPr>
+          <w:p>
+            <w:pPr/>
+            <w:r>
+              <w:t xml:space="preserve">Table headers, secondary headings</w:t>
+            </w:r>
+          </w:p>
+        </w:tc>
+        <w:tc>
+          <w:tcPr>
+            <w:tcW w:w="2862" w:type="dxa"/>
+          </w:tcPr>
+          <w:p>
+            <w:pPr/>
+            <w:r>
+              <w:t xml:space="preserve">10.35 on white</w:t>
+            </w:r>
+          </w:p>
+        </w:tc>
+      </w:tr>
+      <w:tr>
+        <w:tc>
+          <w:tcPr>
+            <w:tcW w:w="1916" w:type="dxa"/>
+          </w:tcPr>
+          <w:p>
+            <w:pPr/>
+            <w:r>
+              <w:rPr>
+                <w:rStyle w:val="CodeChar"/>
+              </w:rPr>
+              <w:t xml:space="preserve">slate-600</w:t>
+            </w:r>
+          </w:p>
+        </w:tc>
+        <w:tc>
+          <w:tcPr>
+            <w:tcW w:w="1261" w:type="dxa"/>
+          </w:tcPr>
+          <w:p>
+            <w:pPr/>
+            <w:r>
+              <w:t xml:space="preserve">#475569</w:t>
+            </w:r>
+          </w:p>
+        </w:tc>
+        <w:tc>
+          <w:tcPr>
+            <w:tcW w:w="3321" w:type="dxa"/>
+          </w:tcPr>
+          <w:p>
+            <w:pPr/>
+            <w:r>
+              <w:t xml:space="preserve">Secondary text on any surface</w:t>
+            </w:r>
+          </w:p>
+        </w:tc>
+        <w:tc>
+          <w:tcPr>
+            <w:tcW w:w="2862" w:type="dxa"/>
+          </w:tcPr>
+          <w:p>
+            <w:pPr/>
+            <w:r>
+              <w:t xml:space="preserve">7.00 on the page background</w:t>
+            </w:r>
+          </w:p>
+        </w:tc>
+      </w:tr>
+      <w:tr>
+        <w:tc>
+          <w:tcPr>
+            <w:tcW w:w="1916" w:type="dxa"/>
+          </w:tcPr>
+          <w:p>
+            <w:pPr/>
+            <w:r>
+              <w:rPr>
+                <w:rStyle w:val="CodeChar"/>
+              </w:rPr>
+              <w:t xml:space="preserve">slate-500</w:t>
+            </w:r>
+          </w:p>
+        </w:tc>
+        <w:tc>
+          <w:tcPr>
+            <w:tcW w:w="1261" w:type="dxa"/>
+          </w:tcPr>
+          <w:p>
+            <w:pPr/>
+            <w:r>
+              <w:t xml:space="preserve">#64748B</w:t>
+            </w:r>
+          </w:p>
+        </w:tc>
+        <w:tc>
+          <w:tcPr>
+            <w:tcW w:w="3321" w:type="dxa"/>
+          </w:tcPr>
+          <w:p>
+            <w:pPr/>
+            <w:r>
+              <w:t xml:space="preserve">Hints and placeholders on white only</w:t>
+            </w:r>
+          </w:p>
+        </w:tc>
+        <w:tc>
+          <w:tcPr>
+            <w:tcW w:w="2862" w:type="dxa"/>
+          </w:tcPr>
+          <w:p>
+            <w:pPr/>
+            <w:r>
+              <w:t xml:space="preserve">4.76 on white, but 4.40 on the page background, so not allowed there</w:t>
+            </w:r>
+          </w:p>
+        </w:tc>
+      </w:tr>
+      <w:tr>
+        <w:tc>
+          <w:tcPr>
+            <w:tcW w:w="1916" w:type="dxa"/>
+          </w:tcPr>
+          <w:p>
+            <w:pPr/>
+            <w:r>
+              <w:rPr>
+                <w:rStyle w:val="CodeChar"/>
+              </w:rPr>
+              <w:t xml:space="preserve">control-border</w:t>
+            </w:r>
+          </w:p>
+        </w:tc>
+        <w:tc>
+          <w:tcPr>
+            <w:tcW w:w="1261" w:type="dxa"/>
+          </w:tcPr>
+          <w:p>
+            <w:pPr/>
+            <w:r>
+              <w:t xml:space="preserve">#7C8AA0</w:t>
+            </w:r>
+          </w:p>
+        </w:tc>
+        <w:tc>
+          <w:tcPr>
+            <w:tcW w:w="3321" w:type="dxa"/>
+          </w:tcPr>
+          <w:p>
+            <w:pPr/>
+            <w:r>
+              <w:t xml:space="preserve">Borders of inputs, checkboxes and outline buttons</w:t>
+            </w:r>
+          </w:p>
+        </w:tc>
+        <w:tc>
+          <w:tcPr>
+            <w:tcW w:w="2862" w:type="dxa"/>
+          </w:tcPr>
+          <w:p>
+            <w:pPr/>
+            <w:r>
+              <w:t xml:space="preserve">3.50 on white, 3.23 on the page background (3:1 is required)</w:t>
+            </w:r>
+          </w:p>
+        </w:tc>
+      </w:tr>
+      <w:tr>
+        <w:tc>
+          <w:tcPr>
+            <w:tcW w:w="1916" w:type="dxa"/>
+          </w:tcPr>
+          <w:p>
+            <w:pPr/>
+            <w:r>
+              <w:rPr>
+                <w:rStyle w:val="CodeChar"/>
+              </w:rPr>
+              <w:t xml:space="preserve">line</w:t>
+            </w:r>
+          </w:p>
+        </w:tc>
+        <w:tc>
+          <w:tcPr>
+            <w:tcW w:w="1261" w:type="dxa"/>
+          </w:tcPr>
+          <w:p>
+            <w:pPr/>
+            <w:r>
+              <w:t xml:space="preserve">#E2E8F0</w:t>
+            </w:r>
+          </w:p>
+        </w:tc>
+        <w:tc>
+          <w:tcPr>
+            <w:tcW w:w="3321" w:type="dxa"/>
+          </w:tcPr>
+          <w:p>
+            <w:pPr/>
+            <w:r>
+              <w:t xml:space="preserve">Dividers only, never the edge of a control</w:t>
+            </w:r>
+          </w:p>
+        </w:tc>
+        <w:tc>
+          <w:tcPr>
+            <w:tcW w:w="2862" w:type="dxa"/>
+          </w:tcPr>
+          <w:p>
+            <w:pPr/>
+            <w:r>
+              <w:t xml:space="preserve">Decorative</w:t>
+            </w:r>
+          </w:p>
+        </w:tc>
+      </w:tr>
+      <w:tr>
+        <w:tc>
+          <w:tcPr>
+            <w:tcW w:w="1916" w:type="dxa"/>
+          </w:tcPr>
+          <w:p>
+            <w:pPr/>
+            <w:r>
+              <w:rPr>
+                <w:rStyle w:val="CodeChar"/>
+              </w:rPr>
+              <w:t xml:space="preserve">page</w:t>
+            </w:r>
+          </w:p>
+        </w:tc>
+        <w:tc>
+          <w:tcPr>
+            <w:tcW w:w="1261" w:type="dxa"/>
+          </w:tcPr>
+          <w:p>
+            <w:pPr/>
+            <w:r>
+              <w:t xml:space="preserve">#F4F6FA</w:t>
+            </w:r>
+          </w:p>
+        </w:tc>
+        <w:tc>
+          <w:tcPr>
+            <w:tcW w:w="3321" w:type="dxa"/>
+          </w:tcPr>
+          <w:p>
+            <w:pPr/>
+            <w:r>
+              <w:t xml:space="preserve">App background; cards are white</w:t>
+            </w:r>
+          </w:p>
+        </w:tc>
+        <w:tc>
+          <w:tcPr>
+            <w:tcW w:w="2862" w:type="dxa"/>
+          </w:tcPr>
+          <w:p>
+            <w:pPr/>
+            <w:r>
+              <w:t xml:space="preserve">Not applicable</w:t>
+            </w:r>
+          </w:p>
+        </w:tc>
+      </w:tr>
+      <w:tr>
+        <w:tc>
+          <w:tcPr>
+            <w:tcW w:w="1916" w:type="dxa"/>
+          </w:tcPr>
+          <w:p>
+            <w:pPr/>
+            <w:r>
+              <w:rPr>
+                <w:rStyle w:val="CodeChar"/>
+              </w:rPr>
+              <w:t xml:space="preserve">danger</w:t>
+            </w:r>
+          </w:p>
+        </w:tc>
+        <w:tc>
+          <w:tcPr>
+            <w:tcW w:w="1261" w:type="dxa"/>
+          </w:tcPr>
+          <w:p>
+            <w:pPr/>
+            <w:r>
+              <w:t xml:space="preserve">#B91C1C</w:t>
+            </w:r>
+          </w:p>
+        </w:tc>
+        <w:tc>
+          <w:tcPr>
+            <w:tcW w:w="3321" w:type="dxa"/>
+          </w:tcPr>
+          <w:p>
+            <w:pPr/>
+            <w:r>
+              <w:t xml:space="preserve">Errors and destructive buttons</w:t>
+            </w:r>
+          </w:p>
+        </w:tc>
+        <w:tc>
+          <w:tcPr>
+            <w:tcW w:w="2862" w:type="dxa"/>
+          </w:tcPr>
+          <w:p>
+            <w:pPr/>
+            <w:r>
+              <w:t xml:space="preserve">6.47 on white</w:t>
+            </w:r>
+          </w:p>
+        </w:tc>
+      </w:tr>
+      <w:tr>
+        <w:tc>
+          <w:tcPr>
+            <w:tcW w:w="1916" w:type="dxa"/>
+          </w:tcPr>
+          <w:p>
+            <w:pPr/>
+            <w:r>
+              <w:rPr>
+                <w:rStyle w:val="CodeChar"/>
+              </w:rPr>
+              <w:t xml:space="preserve">success</w:t>
+            </w:r>
+          </w:p>
+        </w:tc>
+        <w:tc>
+          <w:tcPr>
+            <w:tcW w:w="1261" w:type="dxa"/>
+          </w:tcPr>
+          <w:p>
+            <w:pPr/>
+            <w:r>
+              <w:t xml:space="preserve">#166534</w:t>
+            </w:r>
+          </w:p>
+        </w:tc>
+        <w:tc>
+          <w:tcPr>
+            <w:tcW w:w="3321" w:type="dxa"/>
+          </w:tcPr>
+          <w:p>
+            <w:pPr/>
+            <w:r>
+              <w:t xml:space="preserve">Confirmations</w:t>
+            </w:r>
+          </w:p>
+        </w:tc>
+        <w:tc>
+          <w:tcPr>
+            <w:tcW w:w="2862" w:type="dxa"/>
+          </w:tcPr>
+          <w:p>
+            <w:pPr/>
+            <w:r>
+              <w:t xml:space="preserve">7.13 on white</w:t>
+            </w:r>
+          </w:p>
+        </w:tc>
+      </w:tr>
+      <w:tr>
+        <w:tc>
+          <w:tcPr>
+            <w:tcW w:w="1916" w:type="dxa"/>
+          </w:tcPr>
+          <w:p>
+            <w:pPr/>
+            <w:r>
+              <w:rPr>
+                <w:rStyle w:val="CodeChar"/>
+              </w:rPr>
+              <w:t xml:space="preserve">warning</w:t>
+            </w:r>
+          </w:p>
+        </w:tc>
+        <w:tc>
+          <w:tcPr>
+            <w:tcW w:w="1261" w:type="dxa"/>
+          </w:tcPr>
+          <w:p>
+            <w:pPr/>
+            <w:r>
+              <w:t xml:space="preserve">#92400E on #FEF3C7</w:t>
+            </w:r>
+          </w:p>
+        </w:tc>
+        <w:tc>
+          <w:tcPr>
+            <w:tcW w:w="3321" w:type="dxa"/>
+          </w:tcPr>
+          <w:p>
+            <w:pPr/>
+            <w:r>
+              <w:t xml:space="preserve">Warnings</w:t>
+            </w:r>
+          </w:p>
+        </w:tc>
+        <w:tc>
+          <w:tcPr>
+            <w:tcW w:w="2862" w:type="dxa"/>
+          </w:tcPr>
+          <w:p>
+            <w:pPr/>
+            <w:r>
+              <w:t xml:space="preserve">6.37</w:t>
+            </w:r>
+          </w:p>
+        </w:tc>
+      </w:tr>
+    </w:tbl>
+    <w:p>
+      <w:pPr/>
+      <w:r>
+        <w:t xml:space="preserve">On the navy sidebar, active text is white (13.61), inactive items are </w:t>
+      </w:r>
+      <w:r>
+        <w:rPr>
+          <w:rStyle w:val="CodeChar"/>
+        </w:rPr>
+        <w:t xml:space="preserve">#CBD5E1</w:t>
+      </w:r>
+      <w:r>
+        <w:t xml:space="preserve"> (9.16) and captions </w:t>
+      </w:r>
+      <w:r>
+        <w:rPr>
+          <w:rStyle w:val="CodeChar"/>
+        </w:rPr>
+        <w:t xml:space="preserve">#94A3B8</w:t>
+      </w:r>
+      <w:r>
+        <w:t xml:space="preserve"> (5.31). The active item is white text on </w:t>
+      </w:r>
+      <w:r>
+        <w:rPr>
+          <w:rStyle w:val="CodeChar"/>
+        </w:rPr>
+        <w:t xml:space="preserve">#1B3F8F</w:t>
+      </w:r>
+      <w:r>
+        <w:t xml:space="preserve"> (9.75) with a 3 px gold marker. Focus is a 2 px ring in </w:t>
+      </w:r>
+      <w:r>
+        <w:rPr>
+          <w:rStyle w:val="CodeChar"/>
+        </w:rPr>
+        <w:t xml:space="preserve">brand-700</w:t>
+      </w:r>
+      <w:r>
+        <w:t xml:space="preserve"> with a 2 px offset on light surfaces, and gold on navy.</w:t>
+      </w:r>
+    </w:p>
+    <w:p>
+      <w:pPr/>
+      <w:r>
+        <w:t xml:space="preserve">Thesis statuses use one chip style: sentence-case label, icon, tinted background.</w:t>
+      </w:r>
+    </w:p>
+    <w:tbl>
+      <w:tblPr>
+        <w:tblStyle w:val="TableGrid"/>
+        <w:tblW w:w="0" w:type="auto"/>
+        <w:tblLayout w:type="fixed"/>
+        <w:tblLook w:val="04A0" w:firstRow="1" w:lastRow="0" w:firstColumn="0" w:lastColumn="0" w:noHBand="0" w:noVBand="1"/>
+      </w:tblPr>
+      <w:tblGrid>
+        <w:gridCol w:w="1966"/>
+        <w:gridCol w:w="1868"/>
+        <w:gridCol w:w="2604"/>
+        <w:gridCol w:w="1814"/>
+        <w:gridCol w:w="1107"/>
+      </w:tblGrid>
+      <w:tr>
+        <w:trPr>
+          <w:tblHeader/>
+        </w:trPr>
+        <w:tc>
+          <w:tcPr>
+            <w:tcW w:w="1966" w:type="dxa"/>
+            <w:shd w:val="clear" w:color="auto" w:fill="F2F2F2"/>
+          </w:tcPr>
+          <w:p>
+            <w:pPr/>
+            <w:r>
+              <w:t xml:space="preserve">Status</w:t>
+            </w:r>
+          </w:p>
+        </w:tc>
+        <w:tc>
+          <w:tcPr>
+            <w:tcW w:w="1868" w:type="dxa"/>
+            <w:shd w:val="clear" w:color="auto" w:fill="F2F2F2"/>
+          </w:tcPr>
+          <w:p>
+            <w:pPr/>
+            <w:r>
+              <w:t xml:space="preserve">Label</w:t>
+            </w:r>
+          </w:p>
+        </w:tc>
+        <w:tc>
+          <w:tcPr>
+            <w:tcW w:w="2604" w:type="dxa"/>
+            <w:shd w:val="clear" w:color="auto" w:fill="F2F2F2"/>
+          </w:tcPr>
+          <w:p>
+            <w:pPr/>
+            <w:r>
+              <w:t xml:space="preserve">Text on tint</w:t>
+            </w:r>
+          </w:p>
+        </w:tc>
+        <w:tc>
+          <w:tcPr>
+            <w:tcW w:w="1814" w:type="dxa"/>
+            <w:shd w:val="clear" w:color="auto" w:fill="F2F2F2"/>
+          </w:tcPr>
+          <w:p>
+            <w:pPr/>
+            <w:r>
+              <w:t xml:space="preserve">Icon</w:t>
+            </w:r>
+          </w:p>
+        </w:tc>
+        <w:tc>
+          <w:tcPr>
+            <w:tcW w:w="1107" w:type="dxa"/>
+            <w:shd w:val="clear" w:color="auto" w:fill="F2F2F2"/>
+          </w:tcPr>
+          <w:p>
+            <w:pPr/>
+            <w:r>
+              <w:t xml:space="preserve">Contrast</w:t>
+            </w:r>
+          </w:p>
+        </w:tc>
+      </w:tr>
+      <w:tr>
+        <w:tc>
+          <w:tcPr>
+            <w:tcW w:w="1966" w:type="dxa"/>
+          </w:tcPr>
+          <w:p>
+            <w:pPr/>
+            <w:r>
+              <w:rPr>
+                <w:rStyle w:val="CodeChar"/>
+              </w:rPr>
+              <w:t xml:space="preserve">draft</w:t>
+            </w:r>
+          </w:p>
+        </w:tc>
+        <w:tc>
+          <w:tcPr>
+            <w:tcW w:w="1868" w:type="dxa"/>
+          </w:tcPr>
+          <w:p>
+            <w:pPr/>
+            <w:r>
+              <w:t xml:space="preserve">Draft</w:t>
+            </w:r>
+          </w:p>
+        </w:tc>
+        <w:tc>
+          <w:tcPr>
+            <w:tcW w:w="2604" w:type="dxa"/>
+          </w:tcPr>
+          <w:p>
+            <w:pPr/>
+            <w:r>
+              <w:t xml:space="preserve">#475569 on #F1F5F9</w:t>
+            </w:r>
+          </w:p>
+        </w:tc>
+        <w:tc>
+          <w:tcPr>
+            <w:tcW w:w="1814" w:type="dxa"/>
+          </w:tcPr>
+          <w:p>
+            <w:pPr/>
+            <w:r>
+              <w:t xml:space="preserve">Pencil</w:t>
+            </w:r>
+          </w:p>
+        </w:tc>
+        <w:tc>
+          <w:tcPr>
+            <w:tcW w:w="1107" w:type="dxa"/>
+          </w:tcPr>
+          <w:p>
+            <w:pPr/>
+            <w:r>
+              <w:t xml:space="preserve">6.92</w:t>
+            </w:r>
+          </w:p>
+        </w:tc>
+      </w:tr>
+      <w:tr>
+        <w:tc>
+          <w:tcPr>
+            <w:tcW w:w="1966" w:type="dxa"/>
+          </w:tcPr>
+          <w:p>
+            <w:pPr/>
+            <w:r>
+              <w:rPr>
+                <w:rStyle w:val="CodeChar"/>
+              </w:rPr>
+              <w:t xml:space="preserve">submitted</w:t>
+            </w:r>
+          </w:p>
+        </w:tc>
+        <w:tc>
+          <w:tcPr>
+            <w:tcW w:w="1868" w:type="dxa"/>
+          </w:tcPr>
+          <w:p>
+            <w:pPr/>
+            <w:r>
+              <w:t xml:space="preserve">Submitted</w:t>
+            </w:r>
+          </w:p>
+        </w:tc>
+        <w:tc>
+          <w:tcPr>
+            <w:tcW w:w="2604" w:type="dxa"/>
+          </w:tcPr>
+          <w:p>
+            <w:pPr/>
+            <w:r>
+              <w:t xml:space="preserve">#1B4DA1 on #E6EEFB</w:t>
+            </w:r>
+          </w:p>
+        </w:tc>
+        <w:tc>
+          <w:tcPr>
+            <w:tcW w:w="1814" w:type="dxa"/>
+          </w:tcPr>
+          <w:p>
+            <w:pPr/>
+            <w:r>
+              <w:t xml:space="preserve">Paper plane</w:t>
+            </w:r>
+          </w:p>
+        </w:tc>
+        <w:tc>
+          <w:tcPr>
+            <w:tcW w:w="1107" w:type="dxa"/>
+          </w:tcPr>
+          <w:p>
+            <w:pPr/>
+            <w:r>
+              <w:t xml:space="preserve">6.86</w:t>
+            </w:r>
+          </w:p>
+        </w:tc>
+      </w:tr>
+      <w:tr>
+        <w:tc>
+          <w:tcPr>
+            <w:tcW w:w="1966" w:type="dxa"/>
+          </w:tcPr>
+          <w:p>
+            <w:pPr/>
+            <w:r>
+              <w:rPr>
+                <w:rStyle w:val="CodeChar"/>
+              </w:rPr>
+              <w:t xml:space="preserve">under_review</w:t>
+            </w:r>
+          </w:p>
+        </w:tc>
+        <w:tc>
+          <w:tcPr>
+            <w:tcW w:w="1868" w:type="dxa"/>
+          </w:tcPr>
+          <w:p>
+            <w:pPr/>
+            <w:r>
+              <w:t xml:space="preserve">Under review</w:t>
+            </w:r>
+          </w:p>
+        </w:tc>
+        <w:tc>
+          <w:tcPr>
+            <w:tcW w:w="2604" w:type="dxa"/>
+          </w:tcPr>
+          <w:p>
+            <w:pPr/>
+            <w:r>
+              <w:t xml:space="preserve">#4338CA on #E0E7FF</w:t>
+            </w:r>
+          </w:p>
+        </w:tc>
+        <w:tc>
+          <w:tcPr>
+            <w:tcW w:w="1814" w:type="dxa"/>
+          </w:tcPr>
+          <w:p>
+            <w:pPr/>
+            <w:r>
+              <w:t xml:space="preserve">Magnifying glass</w:t>
+            </w:r>
+          </w:p>
+        </w:tc>
+        <w:tc>
+          <w:tcPr>
+            <w:tcW w:w="1107" w:type="dxa"/>
+          </w:tcPr>
+          <w:p>
+            <w:pPr/>
+            <w:r>
+              <w:t xml:space="preserve">6.41</w:t>
+            </w:r>
+          </w:p>
+        </w:tc>
+      </w:tr>
+      <w:tr>
+        <w:tc>
+          <w:tcPr>
+            <w:tcW w:w="1966" w:type="dxa"/>
+          </w:tcPr>
+          <w:p>
+            <w:pPr/>
+            <w:r>
+              <w:rPr>
+                <w:rStyle w:val="CodeChar"/>
+              </w:rPr>
+              <w:t xml:space="preserve">revision_requested</w:t>
+            </w:r>
+          </w:p>
+        </w:tc>
+        <w:tc>
+          <w:tcPr>
+            <w:tcW w:w="1868" w:type="dxa"/>
+          </w:tcPr>
+          <w:p>
+            <w:pPr/>
+            <w:r>
+              <w:t xml:space="preserve">Revision requested</w:t>
+            </w:r>
+          </w:p>
+        </w:tc>
+        <w:tc>
+          <w:tcPr>
+            <w:tcW w:w="2604" w:type="dxa"/>
+          </w:tcPr>
+          <w:p>
+            <w:pPr/>
+            <w:r>
+              <w:t xml:space="preserve">#92400E on #FEF3C7</w:t>
+            </w:r>
+          </w:p>
+        </w:tc>
+        <w:tc>
+          <w:tcPr>
+            <w:tcW w:w="1814" w:type="dxa"/>
+          </w:tcPr>
+          <w:p>
+            <w:pPr/>
+            <w:r>
+              <w:t xml:space="preserve">Circular arrow</w:t>
+            </w:r>
+          </w:p>
+        </w:tc>
+        <w:tc>
+          <w:tcPr>
+            <w:tcW w:w="1107" w:type="dxa"/>
+          </w:tcPr>
+          <w:p>
+            <w:pPr/>
+            <w:r>
+              <w:t xml:space="preserve">6.37</w:t>
+            </w:r>
+          </w:p>
+        </w:tc>
+      </w:tr>
+      <w:tr>
+        <w:tc>
+          <w:tcPr>
+            <w:tcW w:w="1966" w:type="dxa"/>
+          </w:tcPr>
+          <w:p>
+            <w:pPr/>
+            <w:r>
+              <w:rPr>
+                <w:rStyle w:val="CodeChar"/>
+              </w:rPr>
+              <w:t xml:space="preserve">accepted</w:t>
+            </w:r>
+          </w:p>
+        </w:tc>
+        <w:tc>
+          <w:tcPr>
+            <w:tcW w:w="1868" w:type="dxa"/>
+          </w:tcPr>
+          <w:p>
+            <w:pPr/>
+            <w:r>
+              <w:t xml:space="preserve">Accepted</w:t>
+            </w:r>
+          </w:p>
+        </w:tc>
+        <w:tc>
+          <w:tcPr>
+            <w:tcW w:w="2604" w:type="dxa"/>
+          </w:tcPr>
+          <w:p>
+            <w:pPr/>
+            <w:r>
+              <w:t xml:space="preserve">#0F766E on #CCFBF1</w:t>
+            </w:r>
+          </w:p>
+        </w:tc>
+        <w:tc>
+          <w:tcPr>
+            <w:tcW w:w="1814" w:type="dxa"/>
+          </w:tcPr>
+          <w:p>
+            <w:pPr/>
+            <w:r>
+              <w:t xml:space="preserve">Check</w:t>
+            </w:r>
+          </w:p>
+        </w:tc>
+        <w:tc>
+          <w:tcPr>
+            <w:tcW w:w="1107" w:type="dxa"/>
+          </w:tcPr>
+          <w:p>
+            <w:pPr/>
+            <w:r>
+              <w:t xml:space="preserve">4.86</w:t>
+            </w:r>
+          </w:p>
+        </w:tc>
+      </w:tr>
+      <w:tr>
+        <w:tc>
+          <w:tcPr>
+            <w:tcW w:w="1966" w:type="dxa"/>
+          </w:tcPr>
+          <w:p>
+            <w:pPr/>
+            <w:r>
+              <w:rPr>
+                <w:rStyle w:val="CodeChar"/>
+              </w:rPr>
+              <w:t xml:space="preserve">rejected</w:t>
+            </w:r>
+          </w:p>
+        </w:tc>
+        <w:tc>
+          <w:tcPr>
+            <w:tcW w:w="1868" w:type="dxa"/>
+          </w:tcPr>
+          <w:p>
+            <w:pPr/>
+            <w:r>
+              <w:t xml:space="preserve">Rejected</w:t>
+            </w:r>
+          </w:p>
+        </w:tc>
+        <w:tc>
+          <w:tcPr>
+            <w:tcW w:w="2604" w:type="dxa"/>
+          </w:tcPr>
+          <w:p>
+            <w:pPr/>
+            <w:r>
+              <w:t xml:space="preserve">#B91C1C on #FEE2E2</w:t>
+            </w:r>
+          </w:p>
+        </w:tc>
+        <w:tc>
+          <w:tcPr>
+            <w:tcW w:w="1814" w:type="dxa"/>
+          </w:tcPr>
+          <w:p>
+            <w:pPr/>
+            <w:r>
+              <w:t xml:space="preserve">Circled x</w:t>
+            </w:r>
+          </w:p>
+        </w:tc>
+        <w:tc>
+          <w:tcPr>
+            <w:tcW w:w="1107" w:type="dxa"/>
+          </w:tcPr>
+          <w:p>
+            <w:pPr/>
+            <w:r>
+              <w:t xml:space="preserve">5.30</w:t>
+            </w:r>
+          </w:p>
+        </w:tc>
+      </w:tr>
+      <w:tr>
+        <w:tc>
+          <w:tcPr>
+            <w:tcW w:w="1966" w:type="dxa"/>
+          </w:tcPr>
+          <w:p>
+            <w:pPr/>
+            <w:r>
+              <w:rPr>
+                <w:rStyle w:val="CodeChar"/>
+              </w:rPr>
+              <w:t xml:space="preserve">published</w:t>
+            </w:r>
+          </w:p>
+        </w:tc>
+        <w:tc>
+          <w:tcPr>
+            <w:tcW w:w="1868" w:type="dxa"/>
+          </w:tcPr>
+          <w:p>
+            <w:pPr/>
+            <w:r>
+              <w:t xml:space="preserve">Published</w:t>
+            </w:r>
+          </w:p>
+        </w:tc>
+        <w:tc>
+          <w:tcPr>
+            <w:tcW w:w="2604" w:type="dxa"/>
+          </w:tcPr>
+          <w:p>
+            <w:pPr/>
+            <w:r>
+              <w:t xml:space="preserve">#166534 on #DCFCE7</w:t>
+            </w:r>
+          </w:p>
+        </w:tc>
+        <w:tc>
+          <w:tcPr>
+            <w:tcW w:w="1814" w:type="dxa"/>
+          </w:tcPr>
+          <w:p>
+            <w:pPr/>
+            <w:r>
+              <w:t xml:space="preserve">Globe</w:t>
+            </w:r>
+          </w:p>
+        </w:tc>
+        <w:tc>
+          <w:tcPr>
+            <w:tcW w:w="1107" w:type="dxa"/>
+          </w:tcPr>
+          <w:p>
+            <w:pPr/>
+            <w:r>
+              <w:t xml:space="preserve">6.49</w:t>
+            </w:r>
+          </w:p>
+        </w:tc>
+      </w:tr>
+      <w:tr>
+        <w:tc>
+          <w:tcPr>
+            <w:tcW w:w="1966" w:type="dxa"/>
+          </w:tcPr>
+          <w:p>
+            <w:pPr/>
+            <w:r>
+              <w:rPr>
+                <w:rStyle w:val="CodeChar"/>
+              </w:rPr>
+              <w:t xml:space="preserve">archived</w:t>
+            </w:r>
+          </w:p>
+        </w:tc>
+        <w:tc>
+          <w:tcPr>
+            <w:tcW w:w="1868" w:type="dxa"/>
+          </w:tcPr>
+          <w:p>
+            <w:pPr/>
+            <w:r>
+              <w:t xml:space="preserve">Archived</w:t>
+            </w:r>
+          </w:p>
+        </w:tc>
+        <w:tc>
+          <w:tcPr>
+            <w:tcW w:w="2604" w:type="dxa"/>
+          </w:tcPr>
+          <w:p>
+            <w:pPr/>
+            <w:r>
+              <w:t xml:space="preserve">#475569 on #E2E8F0</w:t>
+            </w:r>
+          </w:p>
+        </w:tc>
+        <w:tc>
+          <w:tcPr>
+            <w:tcW w:w="1814" w:type="dxa"/>
+          </w:tcPr>
+          <w:p>
+            <w:pPr/>
+            <w:r>
+              <w:t xml:space="preserve">Archive box</w:t>
+            </w:r>
+          </w:p>
+        </w:tc>
+        <w:tc>
+          <w:tcPr>
+            <w:tcW w:w="1107" w:type="dxa"/>
+          </w:tcPr>
+          <w:p>
+            <w:pPr/>
+            <w:r>
+              <w:t xml:space="preserve">6.15</w:t>
+            </w:r>
+          </w:p>
+        </w:tc>
+      </w:tr>
+    </w:tbl>
+    <w:p>
+      <w:pPr/>
+      <w:r>
+        <w:t xml:space="preserve">All user roles share one neutral chip (</w:t>
+      </w:r>
+      <w:r>
+        <w:rPr>
+          <w:rStyle w:val="CodeChar"/>
+        </w:rPr>
+        <w:t xml:space="preserve">#475569</w:t>
+      </w:r>
+      <w:r>
+        <w:t xml:space="preserve"> on </w:t>
+      </w:r>
+      <w:r>
+        <w:rPr>
+          <w:rStyle w:val="CodeChar"/>
+        </w:rPr>
+        <w:t xml:space="preserve">#F1F5F9</w:t>
+      </w:r>
+      <w:r>
+        <w:t xml:space="preserve">) with a small icon and the label; the text names the role and color does not.</w:t>
+      </w:r>
+    </w:p>
+    <w:p>
+      <w:pPr>
+        <w:pStyle w:val="Heading3"/>
+      </w:pPr>
+      <w:r>
+        <w:t xml:space="preserve">Typography</w:t>
+      </w:r>
+    </w:p>
+    <w:p>
+      <w:pPr/>
+      <w:r>
+        <w:t xml:space="preserve">Two families with clearly different jobs. Literata is a serif designed for long reading, so thesis titles and abstracts look like scholarship. Public Sans is a plain, very legible interface face. Load both with </w:t>
+      </w:r>
+      <w:r>
+        <w:rPr>
+          <w:rStyle w:val="CodeChar"/>
+        </w:rPr>
+        <w:t xml:space="preserve">next/font</w:t>
+      </w:r>
+      <w:r>
+        <w:t xml:space="preserve"> so they are self-hosted and cause no layout shift.</w:t>
+      </w:r>
+    </w:p>
+    <w:tbl>
+      <w:tblPr>
+        <w:tblStyle w:val="TableGrid"/>
+        <w:tblW w:w="0" w:type="auto"/>
+        <w:tblLayout w:type="fixed"/>
+        <w:tblLook w:val="04A0" w:firstRow="1" w:lastRow="0" w:firstColumn="0" w:lastColumn="0" w:noHBand="0" w:noVBand="1"/>
+      </w:tblPr>
+      <w:tblGrid>
+        <w:gridCol w:w="3326"/>
+        <w:gridCol w:w="1501"/>
+        <w:gridCol w:w="2713"/>
+        <w:gridCol w:w="1820"/>
+      </w:tblGrid>
+      <w:tr>
+        <w:trPr>
+          <w:tblHeader/>
+        </w:trPr>
+        <w:tc>
+          <w:tcPr>
+            <w:tcW w:w="3326" w:type="dxa"/>
+            <w:shd w:val="clear" w:color="auto" w:fill="F2F2F2"/>
+          </w:tcPr>
+          <w:p>
+            <w:pPr/>
+            <w:r>
+              <w:t xml:space="preserve">Role</w:t>
+            </w:r>
+          </w:p>
+        </w:tc>
+        <w:tc>
+          <w:tcPr>
+            <w:tcW w:w="1501" w:type="dxa"/>
+            <w:shd w:val="clear" w:color="auto" w:fill="F2F2F2"/>
+          </w:tcPr>
+          <w:p>
+            <w:pPr/>
+            <w:r>
+              <w:t xml:space="preserve">Face</w:t>
+            </w:r>
+          </w:p>
+        </w:tc>
+        <w:tc>
+          <w:tcPr>
+            <w:tcW w:w="2713" w:type="dxa"/>
+            <w:shd w:val="clear" w:color="auto" w:fill="F2F2F2"/>
+          </w:tcPr>
+          <w:p>
+            <w:pPr/>
+            <w:r>
+              <w:t xml:space="preserve">Size and line height</w:t>
+            </w:r>
+          </w:p>
+        </w:tc>
+        <w:tc>
+          <w:tcPr>
+            <w:tcW w:w="1820" w:type="dxa"/>
+            <w:shd w:val="clear" w:color="auto" w:fill="F2F2F2"/>
+          </w:tcPr>
+          <w:p>
+            <w:pPr/>
+            <w:r>
+              <w:t xml:space="preserve">Weight</w:t>
+            </w:r>
+          </w:p>
+        </w:tc>
+      </w:tr>
+      <w:tr>
+        <w:tc>
+          <w:tcPr>
+            <w:tcW w:w="3326" w:type="dxa"/>
+          </w:tcPr>
+          <w:p>
+            <w:pPr/>
+            <w:r>
+              <w:t xml:space="preserve">Page title</w:t>
+            </w:r>
+          </w:p>
+        </w:tc>
+        <w:tc>
+          <w:tcPr>
+            <w:tcW w:w="1501" w:type="dxa"/>
+          </w:tcPr>
+          <w:p>
+            <w:pPr/>
+            <w:r>
+              <w:t xml:space="preserve">Literata</w:t>
+            </w:r>
+          </w:p>
+        </w:tc>
+        <w:tc>
+          <w:tcPr>
+            <w:tcW w:w="2713" w:type="dxa"/>
+          </w:tcPr>
+          <w:p>
+            <w:pPr/>
+            <w:r>
+              <w:t xml:space="preserve">30 / 36</w:t>
+            </w:r>
+          </w:p>
+        </w:tc>
+        <w:tc>
+          <w:tcPr>
+            <w:tcW w:w="1820" w:type="dxa"/>
+          </w:tcPr>
+          <w:p>
+            <w:pPr/>
+            <w:r>
+              <w:t xml:space="preserve">600</w:t>
+            </w:r>
+          </w:p>
+        </w:tc>
+      </w:tr>
+      <w:tr>
+        <w:tc>
+          <w:tcPr>
+            <w:tcW w:w="3326" w:type="dxa"/>
+          </w:tcPr>
+          <w:p>
+            <w:pPr/>
+            <w:r>
+              <w:t xml:space="preserve">Section title</w:t>
+            </w:r>
+          </w:p>
+        </w:tc>
+        <w:tc>
+          <w:tcPr>
+            <w:tcW w:w="1501" w:type="dxa"/>
+          </w:tcPr>
+          <w:p>
+            <w:pPr/>
+            <w:r>
+              <w:t xml:space="preserve">Literata</w:t>
+            </w:r>
+          </w:p>
+        </w:tc>
+        <w:tc>
+          <w:tcPr>
+            <w:tcW w:w="2713" w:type="dxa"/>
+          </w:tcPr>
+          <w:p>
+            <w:pPr/>
+            <w:r>
+              <w:t xml:space="preserve">22 / 30</w:t>
+            </w:r>
+          </w:p>
+        </w:tc>
+        <w:tc>
+          <w:tcPr>
+            <w:tcW w:w="1820" w:type="dxa"/>
+          </w:tcPr>
+          <w:p>
+            <w:pPr/>
+            <w:r>
+              <w:t xml:space="preserve">600</w:t>
+            </w:r>
+          </w:p>
+        </w:tc>
+      </w:tr>
+      <w:tr>
+        <w:tc>
+          <w:tcPr>
+            <w:tcW w:w="3326" w:type="dxa"/>
+          </w:tcPr>
+          <w:p>
+            <w:pPr/>
+            <w:r>
+              <w:t xml:space="preserve">Thesis title in lists and cards</w:t>
+            </w:r>
+          </w:p>
+        </w:tc>
+        <w:tc>
+          <w:tcPr>
+            <w:tcW w:w="1501" w:type="dxa"/>
+          </w:tcPr>
+          <w:p>
+            <w:pPr/>
+            <w:r>
+              <w:t xml:space="preserve">Literata</w:t>
+            </w:r>
+          </w:p>
+        </w:tc>
+        <w:tc>
+          <w:tcPr>
+            <w:tcW w:w="2713" w:type="dxa"/>
+          </w:tcPr>
+          <w:p>
+            <w:pPr/>
+            <w:r>
+              <w:t xml:space="preserve">18 / 26</w:t>
+            </w:r>
+          </w:p>
+        </w:tc>
+        <w:tc>
+          <w:tcPr>
+            <w:tcW w:w="1820" w:type="dxa"/>
+          </w:tcPr>
+          <w:p>
+            <w:pPr/>
+            <w:r>
+              <w:t xml:space="preserve">600</w:t>
+            </w:r>
+          </w:p>
+        </w:tc>
+      </w:tr>
+      <w:tr>
+        <w:tc>
+          <w:tcPr>
+            <w:tcW w:w="3326" w:type="dxa"/>
+          </w:tcPr>
+          <w:p>
+            <w:pPr/>
+            <w:r>
+              <w:t xml:space="preserve">Reading text such as abstracts</w:t>
+            </w:r>
+          </w:p>
+        </w:tc>
+        <w:tc>
+          <w:tcPr>
+            <w:tcW w:w="1501" w:type="dxa"/>
+          </w:tcPr>
+          <w:p>
+            <w:pPr/>
+            <w:r>
+              <w:t xml:space="preserve">Literata</w:t>
+            </w:r>
+          </w:p>
+        </w:tc>
+        <w:tc>
+          <w:tcPr>
+            <w:tcW w:w="2713" w:type="dxa"/>
+          </w:tcPr>
+          <w:p>
+            <w:pPr/>
+            <w:r>
+              <w:t xml:space="preserve">17 / 28, at most 70 characters per line</w:t>
+            </w:r>
+          </w:p>
+        </w:tc>
+        <w:tc>
+          <w:tcPr>
+            <w:tcW w:w="1820" w:type="dxa"/>
+          </w:tcPr>
+          <w:p>
+            <w:pPr/>
+            <w:r>
+              <w:t xml:space="preserve">400</w:t>
+            </w:r>
+          </w:p>
+        </w:tc>
+      </w:tr>
+      <w:tr>
+        <w:tc>
+          <w:tcPr>
+            <w:tcW w:w="3326" w:type="dxa"/>
+          </w:tcPr>
+          <w:p>
+            <w:pPr/>
+            <w:r>
+              <w:t xml:space="preserve">Interface text</w:t>
+            </w:r>
+          </w:p>
+        </w:tc>
+        <w:tc>
+          <w:tcPr>
+            <w:tcW w:w="1501" w:type="dxa"/>
+          </w:tcPr>
+          <w:p>
+            <w:pPr/>
+            <w:r>
+              <w:t xml:space="preserve">Public Sans</w:t>
+            </w:r>
+          </w:p>
+        </w:tc>
+        <w:tc>
+          <w:tcPr>
+            <w:tcW w:w="2713" w:type="dxa"/>
+          </w:tcPr>
+          <w:p>
+            <w:pPr/>
+            <w:r>
+              <w:t xml:space="preserve">16 / 24</w:t>
+            </w:r>
+          </w:p>
+        </w:tc>
+        <w:tc>
+          <w:tcPr>
+            <w:tcW w:w="1820" w:type="dxa"/>
+          </w:tcPr>
+          <w:p>
+            <w:pPr/>
+            <w:r>
+              <w:t xml:space="preserve">400</w:t>
+            </w:r>
+          </w:p>
+        </w:tc>
+      </w:tr>
+      <w:tr>
+        <w:tc>
+          <w:tcPr>
+            <w:tcW w:w="3326" w:type="dxa"/>
+          </w:tcPr>
+          <w:p>
+            <w:pPr/>
+            <w:r>
+              <w:t xml:space="preserve">Tables, forms, menus</w:t>
+            </w:r>
+          </w:p>
+        </w:tc>
+        <w:tc>
+          <w:tcPr>
+            <w:tcW w:w="1501" w:type="dxa"/>
+          </w:tcPr>
+          <w:p>
+            <w:pPr/>
+            <w:r>
+              <w:t xml:space="preserve">Public Sans</w:t>
+            </w:r>
+          </w:p>
+        </w:tc>
+        <w:tc>
+          <w:tcPr>
+            <w:tcW w:w="2713" w:type="dxa"/>
+          </w:tcPr>
+          <w:p>
+            <w:pPr/>
+            <w:r>
+              <w:t xml:space="preserve">14 / 20</w:t>
+            </w:r>
+          </w:p>
+        </w:tc>
+        <w:tc>
+          <w:tcPr>
+            <w:tcW w:w="1820" w:type="dxa"/>
+          </w:tcPr>
+          <w:p>
+            <w:pPr/>
+            <w:r>
+              <w:t xml:space="preserve">400, labels 500</w:t>
+            </w:r>
+          </w:p>
+        </w:tc>
+      </w:tr>
+      <w:tr>
+        <w:tc>
+          <w:tcPr>
+            <w:tcW w:w="3326" w:type="dxa"/>
+          </w:tcPr>
+          <w:p>
+            <w:pPr/>
+            <w:r>
+              <w:t xml:space="preserve">Captions and legal text</w:t>
+            </w:r>
+          </w:p>
+        </w:tc>
+        <w:tc>
+          <w:tcPr>
+            <w:tcW w:w="1501" w:type="dxa"/>
+          </w:tcPr>
+          <w:p>
+            <w:pPr/>
+            <w:r>
+              <w:t xml:space="preserve">Public Sans</w:t>
+            </w:r>
+          </w:p>
+        </w:tc>
+        <w:tc>
+          <w:tcPr>
+            <w:tcW w:w="2713" w:type="dxa"/>
+          </w:tcPr>
+          <w:p>
+            <w:pPr/>
+            <w:r>
+              <w:t xml:space="preserve">12 / 16, the minimum</w:t>
+            </w:r>
+          </w:p>
+        </w:tc>
+        <w:tc>
+          <w:tcPr>
+            <w:tcW w:w="1820" w:type="dxa"/>
+          </w:tcPr>
+          <w:p>
+            <w:pPr/>
+            <w:r>
+              <w:t xml:space="preserve">400</w:t>
+            </w:r>
+          </w:p>
+        </w:tc>
+      </w:tr>
+    </w:tbl>
+    <w:p>
+      <w:pPr/>
+      <w:r>
+        <w:t xml:space="preserve">Use sentence case everywhere. No all-capital labels, no letter-spacing tricks, and tabular figures for numbers in tables.</w:t>
+      </w:r>
+    </w:p>
+    <w:p>
+      <w:pPr>
+        <w:pStyle w:val="Heading3"/>
+      </w:pPr>
+      <w:r>
+        <w:t xml:space="preserve">Layout and app shell</w:t>
+      </w:r>
+    </w:p>
+    <w:p>
+      <w:pPr>
+        <w:pStyle w:val="ListParagraph"/>
+        <w:numPr>
+          <w:ilvl w:val="0"/>
+          <w:numId w:val="14"/>
+        </w:numPr>
+      </w:pPr>
+      <w:r>
+        <w:rPr>
+          <w:b/>
+        </w:rPr>
+        <w:t xml:space="preserve">Spacing</w:t>
+      </w:r>
+      <w:r>
+        <w:t xml:space="preserve"> uses a 4 px base: 4, 8, 12, 16, 24, 32, 48.</w:t>
+      </w:r>
+    </w:p>
+    <w:p>
+      <w:pPr>
+        <w:pStyle w:val="ListParagraph"/>
+        <w:numPr>
+          <w:ilvl w:val="0"/>
+          <w:numId w:val="14"/>
+        </w:numPr>
+      </w:pPr>
+      <w:r>
+        <w:rPr>
+          <w:b/>
+        </w:rPr>
+        <w:t xml:space="preserve">Corners</w:t>
+      </w:r>
+      <w:r>
+        <w:t xml:space="preserve"> follow the hierarchy: 6 px for controls, 10 px for cards and panels, 14 px for dialogs and drawers.</w:t>
+      </w:r>
+    </w:p>
+    <w:p>
+      <w:pPr>
+        <w:pStyle w:val="ListParagraph"/>
+        <w:numPr>
+          <w:ilvl w:val="0"/>
+          <w:numId w:val="14"/>
+        </w:numPr>
+      </w:pPr>
+      <w:r>
+        <w:rPr>
+          <w:b/>
+        </w:rPr>
+        <w:t xml:space="preserve">Depth:</w:t>
+      </w:r>
+      <w:r>
+        <w:t xml:space="preserve"> cards have a 1 px </w:t>
+      </w:r>
+      <w:r>
+        <w:rPr>
+          <w:rStyle w:val="CodeChar"/>
+        </w:rPr>
+        <w:t xml:space="preserve">line</w:t>
+      </w:r>
+      <w:r>
+        <w:t xml:space="preserve"> border and no shadow. Only menus, dialogs and drawers cast a shadow.</w:t>
+      </w:r>
+    </w:p>
+    <w:p>
+      <w:pPr>
+        <w:pStyle w:val="ListParagraph"/>
+        <w:numPr>
+          <w:ilvl w:val="0"/>
+          <w:numId w:val="14"/>
+        </w:numPr>
+      </w:pPr>
+      <w:r>
+        <w:rPr>
+          <w:b/>
+        </w:rPr>
+        <w:t xml:space="preserve">Widths:</w:t>
+      </w:r>
+      <w:r>
+        <w:t xml:space="preserve"> sidebar 256 px (72 px collapsed), header 64 px, content at most 1280 px in the app and 1200 px on public pages, page padding 24 px (16 px under 768 px).</w:t>
+      </w:r>
+    </w:p>
+    <w:p>
+      <w:pPr>
+        <w:pStyle w:val="ListParagraph"/>
+        <w:numPr>
+          <w:ilvl w:val="0"/>
+          <w:numId w:val="14"/>
+        </w:numPr>
+      </w:pPr>
+      <w:r>
+        <w:rPr>
+          <w:b/>
+        </w:rPr>
+        <w:t xml:space="preserve">Sidebar</w:t>
+      </w:r>
+      <w:r>
+        <w:t xml:space="preserve"> (navy): the emblem in a white circle with "PECIT Thesis Archive" at the top, then groups named in sentence case: "My work" (the screens for the person's role), "Archive" and "Administration". Show only what the role may open and never show a disabled link. It collapses to icons under 1100 px and becomes a drawer under 768 px.</w:t>
+      </w:r>
+    </w:p>
+    <w:p>
+      <w:pPr>
+        <w:pStyle w:val="ListParagraph"/>
+        <w:numPr>
+          <w:ilvl w:val="0"/>
+          <w:numId w:val="14"/>
+        </w:numPr>
+      </w:pPr>
+      <w:r>
+        <w:rPr>
+          <w:b/>
+        </w:rPr>
+        <w:t xml:space="preserve">Header</w:t>
+      </w:r>
+      <w:r>
+        <w:t xml:space="preserve"> (white): menu button, breadcrumb, then the bell with an unread count that opens a list with "Mark all as read", and the user menu (photo or initials, name, role, Profile, Sign out).</w:t>
+      </w:r>
+    </w:p>
+    <w:p>
+      <w:pPr>
+        <w:pStyle w:val="ListParagraph"/>
+        <w:numPr>
+          <w:ilvl w:val="0"/>
+          <w:numId w:val="14"/>
+        </w:numPr>
+      </w:pPr>
+      <w:r>
+        <w:rPr>
+          <w:b/>
+        </w:rPr>
+        <w:t xml:space="preserve">Every page</w:t>
+      </w:r>
+      <w:r>
+        <w:t xml:space="preserve"> has the same skeleton: a serif title with one sentence of purpose and the primary action at the right, then the toolbar, then the content.</w:t>
+      </w:r>
+    </w:p>
+    <w:p>
+      <w:pPr>
+        <w:pStyle w:val="ListParagraph"/>
+        <w:numPr>
+          <w:ilvl w:val="0"/>
+          <w:numId w:val="14"/>
+        </w:numPr>
+      </w:pPr>
+      <w:r>
+        <w:rPr>
+          <w:b/>
+        </w:rPr>
+        <w:t xml:space="preserve">Footer</w:t>
+      </w:r>
+      <w:r>
+        <w:t xml:space="preserve"> is one line with a link to the full privacy notice.</w:t>
+      </w:r>
+    </w:p>
+    <w:p>
+      <w:pPr>
+        <w:pStyle w:val="Heading3"/>
+      </w:pPr>
+      <w:r>
+        <w:t xml:space="preserve">Components</w:t>
+      </w:r>
+    </w:p>
+    <w:tbl>
+      <w:tblPr>
+        <w:tblStyle w:val="TableGrid"/>
+        <w:tblW w:w="0" w:type="auto"/>
+        <w:tblLayout w:type="fixed"/>
+        <w:tblLook w:val="04A0" w:firstRow="1" w:lastRow="0" w:firstColumn="0" w:lastColumn="0" w:noHBand="0" w:noVBand="1"/>
+      </w:tblPr>
+      <w:tblGrid>
+        <w:gridCol w:w="2327"/>
+        <w:gridCol w:w="7032"/>
+      </w:tblGrid>
+      <w:tr>
+        <w:trPr>
+          <w:tblHeader/>
+        </w:trPr>
+        <w:tc>
+          <w:tcPr>
+            <w:tcW w:w="2327" w:type="dxa"/>
+            <w:shd w:val="clear" w:color="auto" w:fill="F2F2F2"/>
+          </w:tcPr>
+          <w:p>
+            <w:pPr/>
+            <w:r>
+              <w:t xml:space="preserve">Component</w:t>
+            </w:r>
+          </w:p>
+        </w:tc>
+        <w:tc>
+          <w:tcPr>
+            <w:tcW w:w="7032" w:type="dxa"/>
+            <w:shd w:val="clear" w:color="auto" w:fill="F2F2F2"/>
+          </w:tcPr>
+          <w:p>
+            <w:pPr/>
+            <w:r>
+              <w:t xml:space="preserve">Rules</w:t>
+            </w:r>
+          </w:p>
+        </w:tc>
+      </w:tr>
+      <w:tr>
+        <w:tc>
+          <w:tcPr>
+            <w:tcW w:w="2327" w:type="dxa"/>
+          </w:tcPr>
+          <w:p>
+            <w:pPr/>
+            <w:r>
+              <w:t xml:space="preserve">Buttons</w:t>
+            </w:r>
+          </w:p>
+        </w:tc>
+        <w:tc>
+          <w:tcPr>
+            <w:tcW w:w="7032" w:type="dxa"/>
+          </w:tcPr>
+          <w:p>
+            <w:pPr/>
+            <w:r>
+              <w:t xml:space="preserve">One primary per screen. 40 px high by default, 36 px inside dense tables, never below 24 px as the absolute minimum target. Labels are a verb plus an object ("Register user"). While working, the label says what is happening ("Saving...") and the width does not change. The danger style appears only inside a confirmation dialog.</w:t>
+            </w:r>
+          </w:p>
+        </w:tc>
+      </w:tr>
+      <w:tr>
+        <w:tc>
+          <w:tcPr>
+            <w:tcW w:w="2327" w:type="dxa"/>
+          </w:tcPr>
+          <w:p>
+            <w:pPr/>
+            <w:r>
+              <w:t xml:space="preserve">Forms</w:t>
+            </w:r>
+          </w:p>
+        </w:tc>
+        <w:tc>
+          <w:tcPr>
+            <w:tcW w:w="7032" w:type="dxa"/>
+          </w:tcPr>
+          <w:p>
+            <w:pPr/>
+            <w:r>
+              <w:t xml:space="preserve">A visible label above every field, helper text below, required fields marked in the label. Validate when the person leaves a field and again on submit, show the error under the field and in a summary at the top, and move focus to the first error. Never clear what was typed. Autosave long forms.</w:t>
+            </w:r>
+          </w:p>
+        </w:tc>
+      </w:tr>
+      <w:tr>
+        <w:tc>
+          <w:tcPr>
+            <w:tcW w:w="2327" w:type="dxa"/>
+          </w:tcPr>
+          <w:p>
+            <w:pPr/>
+            <w:r>
+              <w:t xml:space="preserve">Tables</w:t>
+            </w:r>
+          </w:p>
+        </w:tc>
+        <w:tc>
+          <w:tcPr>
+            <w:tcW w:w="7032" w:type="dxa"/>
+          </w:tcPr>
+          <w:p>
+            <w:pPr/>
+            <w:r>
+              <w:t xml:space="preserve">No striping. Rows 56 px high (48 px compact). Sticky header, sortable headers that announce their order, numbers right-aligned, long text cut with the full text on hover and focus. A row menu at the end. A selection bar appears when rows are checked. The footer reads "1-10 of 48" with a page-size choice. Filters are saved in the URL.</w:t>
+            </w:r>
+          </w:p>
+        </w:tc>
+      </w:tr>
+      <w:tr>
+        <w:tc>
+          <w:tcPr>
+            <w:tcW w:w="2327" w:type="dxa"/>
+          </w:tcPr>
+          <w:p>
+            <w:pPr/>
+            <w:r>
+              <w:t xml:space="preserve">Dialogs</w:t>
+            </w:r>
+          </w:p>
+        </w:tc>
+        <w:tc>
+          <w:tcPr>
+            <w:tcW w:w="7032" w:type="dxa"/>
+          </w:tcPr>
+          <w:p>
+            <w:pPr/>
+            <w:r>
+              <w:t xml:space="preserve">For decisions only. The title states the action ("Deactivate Maria Santos?"), the body states the consequence, and the buttons repeat the verb ("Deactivate user" and "Cancel"). Focus is trapped, Esc closes, and focus returns to the button that opened it.</w:t>
+            </w:r>
+          </w:p>
+        </w:tc>
+      </w:tr>
+      <w:tr>
+        <w:tc>
+          <w:tcPr>
+            <w:tcW w:w="2327" w:type="dxa"/>
+          </w:tcPr>
+          <w:p>
+            <w:pPr/>
+            <w:r>
+              <w:t xml:space="preserve">Drawers</w:t>
+            </w:r>
+          </w:p>
+        </w:tc>
+        <w:tc>
+          <w:tcPr>
+            <w:tcW w:w="7032" w:type="dxa"/>
+          </w:tcPr>
+          <w:p>
+            <w:pPr/>
+            <w:r>
+              <w:t xml:space="preserve">For creating or editing a record without losing the list. 480 px wide, same rules as dialogs.</w:t>
+            </w:r>
+          </w:p>
+        </w:tc>
+      </w:tr>
+      <w:tr>
+        <w:tc>
+          <w:tcPr>
+            <w:tcW w:w="2327" w:type="dxa"/>
+          </w:tcPr>
+          <w:p>
+            <w:pPr/>
+            <w:r>
+              <w:t xml:space="preserve">Toasts</w:t>
+            </w:r>
+          </w:p>
+        </w:tc>
+        <w:tc>
+          <w:tcPr>
+            <w:tcW w:w="7032" w:type="dxa"/>
+          </w:tcPr>
+          <w:p>
+            <w:pPr/>
+            <w:r>
+              <w:t xml:space="preserve">One line confirming a finished action in the action's own word ("Published"). Stay 5 seconds. Errors stay until dismissed. Announced to screen readers.</w:t>
+            </w:r>
+          </w:p>
+        </w:tc>
+      </w:tr>
+      <w:tr>
+        <w:tc>
+          <w:tcPr>
+            <w:tcW w:w="2327" w:type="dxa"/>
+          </w:tcPr>
+          <w:p>
+            <w:pPr/>
+            <w:r>
+              <w:t xml:space="preserve">Loading</w:t>
+            </w:r>
+          </w:p>
+        </w:tc>
+        <w:tc>
+          <w:tcPr>
+            <w:tcW w:w="7032" w:type="dxa"/>
+          </w:tcPr>
+          <w:p>
+            <w:pPr/>
+            <w:r>
+              <w:t xml:space="preserve">Skeletons shaped like the final layout. Spinners only inside buttons.</w:t>
+            </w:r>
+          </w:p>
+        </w:tc>
+      </w:tr>
+      <w:tr>
+        <w:tc>
+          <w:tcPr>
+            <w:tcW w:w="2327" w:type="dxa"/>
+          </w:tcPr>
+          <w:p>
+            <w:pPr/>
+            <w:r>
+              <w:t xml:space="preserve">Empty states</w:t>
+            </w:r>
+          </w:p>
+        </w:tc>
+        <w:tc>
+          <w:tcPr>
+            <w:tcW w:w="7032" w:type="dxa"/>
+          </w:tcPr>
+          <w:p>
+            <w:pPr/>
+            <w:r>
+              <w:t xml:space="preserve">Say why it is empty and offer the next action. First use and "no results for these filters" are different messages.</w:t>
+            </w:r>
+          </w:p>
+        </w:tc>
+      </w:tr>
+      <w:tr>
+        <w:tc>
+          <w:tcPr>
+            <w:tcW w:w="2327" w:type="dxa"/>
+          </w:tcPr>
+          <w:p>
+            <w:pPr/>
+            <w:r>
+              <w:t xml:space="preserve">Errors</w:t>
+            </w:r>
+          </w:p>
+        </w:tc>
+        <w:tc>
+          <w:tcPr>
+            <w:tcW w:w="7032" w:type="dxa"/>
+          </w:tcPr>
+          <w:p>
+            <w:pPr/>
+            <w:r>
+              <w:t xml:space="preserve">Say what failed and what to do next, offer Retry, and show a short reference code in small type. Never show raw error text or stack traces.</w:t>
+            </w:r>
+          </w:p>
+        </w:tc>
+      </w:tr>
+      <w:tr>
+        <w:tc>
+          <w:tcPr>
+            <w:tcW w:w="2327" w:type="dxa"/>
+          </w:tcPr>
+          <w:p>
+            <w:pPr/>
+            <w:r>
+              <w:t xml:space="preserve">Icons</w:t>
+            </w:r>
+          </w:p>
+        </w:tc>
+        <w:tc>
+          <w:tcPr>
+            <w:tcW w:w="7032" w:type="dxa"/>
+          </w:tcPr>
+          <w:p>
+            <w:pPr/>
+            <w:r>
+              <w:t xml:space="preserve">One set (Lucide), 20 px, 1.75 stroke. Icon-only buttons have an accessible name and a tooltip.</w:t>
+            </w:r>
+          </w:p>
+        </w:tc>
+      </w:tr>
+      <w:tr>
+        <w:tc>
+          <w:tcPr>
+            <w:tcW w:w="2327" w:type="dxa"/>
+          </w:tcPr>
+          <w:p>
+            <w:pPr/>
+            <w:r>
+              <w:t xml:space="preserve">Tooltips</w:t>
+            </w:r>
+          </w:p>
+        </w:tc>
+        <w:tc>
+          <w:tcPr>
+            <w:tcW w:w="7032" w:type="dxa"/>
+          </w:tcPr>
+          <w:p>
+            <w:pPr/>
+            <w:r>
+              <w:t xml:space="preserve">Extra help only; nothing important is stated only in a tooltip.</w:t>
+            </w:r>
+          </w:p>
+        </w:tc>
+      </w:tr>
+      <w:tr>
+        <w:tc>
+          <w:tcPr>
+            <w:tcW w:w="2327" w:type="dxa"/>
+          </w:tcPr>
+          <w:p>
+            <w:pPr/>
+            <w:r>
+              <w:t xml:space="preserve">Notices</w:t>
+            </w:r>
+          </w:p>
+        </w:tc>
+        <w:tc>
+          <w:tcPr>
+            <w:tcW w:w="7032" w:type="dxa"/>
+          </w:tcPr>
+          <w:p>
+            <w:pPr/>
+            <w:r>
+              <w:t xml:space="preserve">A </w:t>
+            </w:r>
+            <w:r>
+              <w:rPr>
+                <w:rStyle w:val="CodeChar"/>
+              </w:rPr>
+              <w:t xml:space="preserve">gold-100</w:t>
+            </w:r>
+            <w:r>
+              <w:t xml:space="preserve"> banner for a warning that needs action, at page level only.</w:t>
+            </w:r>
+          </w:p>
+        </w:tc>
+      </w:tr>
+    </w:tbl>
+    <w:p>
+      <w:pPr/>
+      <w:r>
+        <w:t xml:space="preserve">Every screen must be built and shown in five states: loading, empty, error, no permission ("You don't have access to this page. Ask the administrator if you need it."), and slow or offline (an upload keeps its progress and offers Retry).</w:t>
+      </w:r>
+    </w:p>
+    <w:p>
+      <w:pPr/>
+      <w:r>
+        <w:rPr>
+          <w:b/>
+        </w:rPr>
+        <w:t xml:space="preserve">Implementation.</w:t>
+      </w:r>
+      <w:r>
+        <w:t xml:space="preserve"> The agent first reports which UI library and CSS approach the project already uses. It themes that library through the tokens and adds no second library. If the project has none, or a mix, use Tailwind CSS with shadcn/ui, whose components are built on accessible Radix primitives. Define the tokens once as CSS variables, and nothing else in the code may hard-code a color, font size or spacing value.</w:t>
+      </w:r>
+    </w:p>
+    <w:p>
+      <w:pPr>
+        <w:pStyle w:val="Heading3"/>
+      </w:pPr>
+      <w:r>
+        <w:t xml:space="preserve">Accessibility and performance targets</w:t>
+      </w:r>
+    </w:p>
+    <w:p>
+      <w:pPr>
+        <w:pStyle w:val="ListParagraph"/>
+        <w:numPr>
+          <w:ilvl w:val="0"/>
+          <w:numId w:val="15"/>
+        </w:numPr>
+      </w:pPr>
+      <w:r>
+        <w:t xml:space="preserve">WCAG 2.2 level AA. Text meets 4.5:1 and control edges and focus rings meet 3:1, which the token table already guarantees when the tokens are used as written.</w:t>
+      </w:r>
+    </w:p>
+    <w:p>
+      <w:pPr>
+        <w:pStyle w:val="ListParagraph"/>
+        <w:numPr>
+          <w:ilvl w:val="0"/>
+          <w:numId w:val="15"/>
+        </w:numPr>
+      </w:pPr>
+      <w:r>
+        <w:t xml:space="preserve">Everything works with the keyboard alone, in a logical order, with a visible focus ring. Dialogs trap focus. A skip link jumps to the main content.</w:t>
+      </w:r>
+    </w:p>
+    <w:p>
+      <w:pPr>
+        <w:pStyle w:val="ListParagraph"/>
+        <w:numPr>
+          <w:ilvl w:val="0"/>
+          <w:numId w:val="15"/>
+        </w:numPr>
+      </w:pPr>
+      <w:r>
+        <w:t xml:space="preserve">Labels for every control, real headings and landmarks, table markup for tables, and </w:t>
+      </w:r>
+      <w:r>
+        <w:rPr>
+          <w:rStyle w:val="CodeChar"/>
+        </w:rPr>
+        <w:t xml:space="preserve">aria-live</w:t>
+      </w:r>
+      <w:r>
+        <w:t xml:space="preserve"> for toasts and upload progress.</w:t>
+      </w:r>
+    </w:p>
+    <w:p>
+      <w:pPr>
+        <w:pStyle w:val="ListParagraph"/>
+        <w:numPr>
+          <w:ilvl w:val="0"/>
+          <w:numId w:val="15"/>
+        </w:numPr>
+      </w:pPr>
+      <w:r>
+        <w:t xml:space="preserve">Meaning is never carried by color alone.</w:t>
+      </w:r>
+    </w:p>
+    <w:p>
+      <w:pPr>
+        <w:pStyle w:val="ListParagraph"/>
+        <w:numPr>
+          <w:ilvl w:val="0"/>
+          <w:numId w:val="15"/>
+        </w:numPr>
+      </w:pPr>
+      <w:r>
+        <w:t xml:space="preserve">The layout works at 200% zoom and at 360 px wide without horizontal scrolling.</w:t>
+      </w:r>
+    </w:p>
+    <w:p>
+      <w:pPr>
+        <w:pStyle w:val="ListParagraph"/>
+        <w:numPr>
+          <w:ilvl w:val="0"/>
+          <w:numId w:val="15"/>
+        </w:numPr>
+      </w:pPr>
+      <w:r>
+        <w:t xml:space="preserve">Respect </w:t>
+      </w:r>
+      <w:r>
+        <w:rPr>
+          <w:rStyle w:val="CodeChar"/>
+        </w:rPr>
+        <w:t xml:space="preserve">prefers-reduced-motion</w:t>
+      </w:r>
+      <w:r>
+        <w:t xml:space="preserve">. The only animation is a wizard step completing and menus opening.</w:t>
+      </w:r>
+    </w:p>
+    <w:p>
+      <w:pPr>
+        <w:pStyle w:val="ListParagraph"/>
+        <w:numPr>
+          <w:ilvl w:val="0"/>
+          <w:numId w:val="15"/>
+        </w:numPr>
+      </w:pPr>
+      <w:r>
+        <w:t xml:space="preserve">Gates: no serious or critical findings from axe on any route, Lighthouse accessibility at least 95, and on a mid-range phone profile a largest contentful paint under 2.5 s, layout shift under 0.1 and interaction delay under 200 ms.</w:t>
+      </w:r>
+    </w:p>
+    <w:p>
+      <w:pPr>
+        <w:pStyle w:val="Heading2"/>
+      </w:pPr>
+      <w:r>
         <w:t xml:space="preserve">Build phases (Phase 0 to 5)</w:t>
       </w:r>
     </w:p>
@@ -4228,7 +7668,7 @@
         <w:pStyle w:val="ListParagraph"/>
         <w:numPr>
           <w:ilvl w:val="0"/>
-          <w:numId w:val="12"/>
+          <w:numId w:val="16"/>
         </w:numPr>
       </w:pPr>
       <w:r>
@@ -4240,7 +7680,7 @@
         <w:pStyle w:val="ListParagraph"/>
         <w:numPr>
           <w:ilvl w:val="0"/>
-          <w:numId w:val="12"/>
+          <w:numId w:val="16"/>
         </w:numPr>
       </w:pPr>
       <w:r>
@@ -4252,7 +7692,7 @@
         <w:pStyle w:val="ListParagraph"/>
         <w:numPr>
           <w:ilvl w:val="0"/>
-          <w:numId w:val="12"/>
+          <w:numId w:val="16"/>
         </w:numPr>
       </w:pPr>
       <w:r>
@@ -4264,7 +7704,7 @@
         <w:pStyle w:val="ListParagraph"/>
         <w:numPr>
           <w:ilvl w:val="0"/>
-          <w:numId w:val="12"/>
+          <w:numId w:val="16"/>
         </w:numPr>
       </w:pPr>
       <w:r>
@@ -4285,7 +7725,7 @@
         <w:pStyle w:val="ListParagraph"/>
         <w:numPr>
           <w:ilvl w:val="0"/>
-          <w:numId w:val="12"/>
+          <w:numId w:val="16"/>
         </w:numPr>
       </w:pPr>
       <w:r>
@@ -4323,7 +7763,7 @@
         <w:pStyle w:val="ListParagraph"/>
         <w:numPr>
           <w:ilvl w:val="0"/>
-          <w:numId w:val="13"/>
+          <w:numId w:val="17"/>
         </w:numPr>
       </w:pPr>
       <w:r>
@@ -4344,7 +7784,7 @@
         <w:pStyle w:val="ListParagraph"/>
         <w:numPr>
           <w:ilvl w:val="0"/>
-          <w:numId w:val="13"/>
+          <w:numId w:val="17"/>
         </w:numPr>
       </w:pPr>
       <w:r>
@@ -4374,7 +7814,7 @@
         <w:pStyle w:val="ListParagraph"/>
         <w:numPr>
           <w:ilvl w:val="0"/>
-          <w:numId w:val="13"/>
+          <w:numId w:val="17"/>
         </w:numPr>
       </w:pPr>
       <w:r>
@@ -4397,7 +7837,7 @@
         <w:pStyle w:val="ListParagraph"/>
         <w:numPr>
           <w:ilvl w:val="0"/>
-          <w:numId w:val="13"/>
+          <w:numId w:val="17"/>
         </w:numPr>
       </w:pPr>
       <w:r>
@@ -4409,7 +7849,7 @@
         <w:pStyle w:val="ListParagraph"/>
         <w:numPr>
           <w:ilvl w:val="0"/>
-          <w:numId w:val="13"/>
+          <w:numId w:val="17"/>
         </w:numPr>
       </w:pPr>
       <w:r>
@@ -4421,7 +7861,7 @@
         <w:pStyle w:val="ListParagraph"/>
         <w:numPr>
           <w:ilvl w:val="0"/>
-          <w:numId w:val="13"/>
+          <w:numId w:val="17"/>
         </w:numPr>
       </w:pPr>
       <w:r>
@@ -4433,7 +7873,7 @@
         <w:pStyle w:val="ListParagraph"/>
         <w:numPr>
           <w:ilvl w:val="0"/>
-          <w:numId w:val="13"/>
+          <w:numId w:val="17"/>
         </w:numPr>
       </w:pPr>
       <w:r>
@@ -4445,7 +7885,7 @@
         <w:pStyle w:val="ListParagraph"/>
         <w:numPr>
           <w:ilvl w:val="0"/>
-          <w:numId w:val="13"/>
+          <w:numId w:val="17"/>
         </w:numPr>
       </w:pPr>
       <w:r>
@@ -4808,7 +8248,7 @@
         <w:pStyle w:val="ListParagraph"/>
         <w:numPr>
           <w:ilvl w:val="0"/>
-          <w:numId w:val="14"/>
+          <w:numId w:val="18"/>
         </w:numPr>
       </w:pPr>
       <w:hyperlink r:id="rId6" w:history="1">
@@ -4825,7 +8265,7 @@
         <w:pStyle w:val="ListParagraph"/>
         <w:numPr>
           <w:ilvl w:val="0"/>
-          <w:numId w:val="14"/>
+          <w:numId w:val="18"/>
         </w:numPr>
       </w:pPr>
       <w:hyperlink r:id="rId5" w:history="1">
@@ -4842,7 +8282,7 @@
         <w:pStyle w:val="ListParagraph"/>
         <w:numPr>
           <w:ilvl w:val="0"/>
-          <w:numId w:val="14"/>
+          <w:numId w:val="18"/>
         </w:numPr>
       </w:pPr>
       <w:hyperlink r:id="rId9" w:history="1">
@@ -4859,7 +8299,7 @@
         <w:pStyle w:val="ListParagraph"/>
         <w:numPr>
           <w:ilvl w:val="0"/>
-          <w:numId w:val="14"/>
+          <w:numId w:val="18"/>
         </w:numPr>
       </w:pPr>
       <w:hyperlink r:id="rId12" w:history="1">
@@ -4876,7 +8316,7 @@
         <w:pStyle w:val="ListParagraph"/>
         <w:numPr>
           <w:ilvl w:val="0"/>
-          <w:numId w:val="14"/>
+          <w:numId w:val="18"/>
         </w:numPr>
       </w:pPr>
       <w:hyperlink r:id="rId4" w:history="1">
@@ -4893,7 +8333,7 @@
         <w:pStyle w:val="ListParagraph"/>
         <w:numPr>
           <w:ilvl w:val="0"/>
-          <w:numId w:val="14"/>
+          <w:numId w:val="18"/>
         </w:numPr>
       </w:pPr>
       <w:hyperlink r:id="rId10" w:history="1">
@@ -4910,7 +8350,7 @@
         <w:pStyle w:val="ListParagraph"/>
         <w:numPr>
           <w:ilvl w:val="0"/>
-          <w:numId w:val="14"/>
+          <w:numId w:val="18"/>
         </w:numPr>
       </w:pPr>
       <w:hyperlink r:id="rId11" w:history="1">
@@ -4927,7 +8367,7 @@
         <w:pStyle w:val="ListParagraph"/>
         <w:numPr>
           <w:ilvl w:val="0"/>
-          <w:numId w:val="14"/>
+          <w:numId w:val="18"/>
         </w:numPr>
       </w:pPr>
       <w:hyperlink r:id="rId13" w:history="1">
@@ -4944,7 +8384,7 @@
         <w:pStyle w:val="ListParagraph"/>
         <w:numPr>
           <w:ilvl w:val="0"/>
-          <w:numId w:val="14"/>
+          <w:numId w:val="18"/>
         </w:numPr>
       </w:pPr>
       <w:hyperlink r:id="rId14" w:history="1">
@@ -5186,15 +8626,27 @@
     </w:lvlOverride>
   </w:num>
   <w:num w:numId="12">
+    <w:abstractNumId w:val="0"/>
+  </w:num>
+  <w:num w:numId="13">
+    <w:abstractNumId w:val="0"/>
+  </w:num>
+  <w:num w:numId="14">
+    <w:abstractNumId w:val="0"/>
+  </w:num>
+  <w:num w:numId="15">
+    <w:abstractNumId w:val="0"/>
+  </w:num>
+  <w:num w:numId="16">
     <w:abstractNumId w:val="1"/>
     <w:lvlOverride w:ilvl="0">
       <w:startOverride w:val="1"/>
     </w:lvlOverride>
   </w:num>
-  <w:num w:numId="13">
+  <w:num w:numId="17">
     <w:abstractNumId w:val="0"/>
   </w:num>
-  <w:num w:numId="14">
+  <w:num w:numId="18">
     <w:abstractNumId w:val="0"/>
   </w:num>
 </w:numbering>

</xml_diff>